<commit_message>
feat: add campus job application tracking module
Add Campus route with dashboard, jobs list, and progress views backed by Zustand and markdown job data. Update App routing and layout chrome (Header, Footer, PageShell). Include campus job board docs, resume assets, restore scripts, and job seed files under src/data/campus-jobs.

Co-authored-by: Cursor <cursoragent@cursor.com>
</commit_message>
<xml_diff>
--- a/docs/秋招简历v1_BACKUP.docx
+++ b/docs/秋招简历v1_BACKUP.docx
@@ -7,8 +7,6 @@
         <w:adjustRightInd w:val="0"/>
         <w:snapToGrid w:val="0"/>
       </w:pPr>
-      <w:bookmarkStart w:id="0" w:name="_GoBack"/>
-      <w:bookmarkEnd w:id="0"/>
       <w:r>
         <w:rPr>
           <w:sz w:val="21"/>
@@ -134,8 +132,8 @@
             <wp:positionV relativeFrom="page">
               <wp:posOffset>323850</wp:posOffset>
             </wp:positionV>
-            <wp:extent cx="761365" cy="1019175"/>
-            <wp:effectExtent l="0" t="0" r="635" b="1905"/>
+            <wp:extent cx="837565" cy="1121410"/>
+            <wp:effectExtent l="0" t="0" r="635" b="6350"/>
             <wp:wrapNone/>
             <wp:docPr id="18" name="图片 18" descr="C:/Users/Tan/Pictures/微信图片_20260121143704_130_535.jpg微信图片_20260121143704_130_535"/>
             <wp:cNvGraphicFramePr>
@@ -160,7 +158,7 @@
                   <pic:spPr>
                     <a:xfrm>
                       <a:off x="0" y="0"/>
-                      <a:ext cx="761365" cy="1019175"/>
+                      <a:ext cx="837565" cy="1121410"/>
                     </a:xfrm>
                     <a:prstGeom prst="rect">
                       <a:avLst/>
@@ -412,6 +410,14 @@
         <w:adjustRightInd w:val="0"/>
         <w:snapToGrid w:val="0"/>
       </w:pPr>
+      <w:bookmarkStart w:id="0" w:name="_GoBack"/>
+      <w:bookmarkEnd w:id="0"/>
+    </w:p>
+    <w:p>
+      <w:pPr>
+        <w:adjustRightInd w:val="0"/>
+        <w:snapToGrid w:val="0"/>
+      </w:pPr>
     </w:p>
     <w:p>
       <w:pPr>
@@ -431,12 +437,12 @@
               <wp:anchor distT="0" distB="0" distL="114300" distR="114300" simplePos="0" relativeHeight="251664384" behindDoc="0" locked="0" layoutInCell="1" allowOverlap="1">
                 <wp:simplePos x="0" y="0"/>
                 <wp:positionH relativeFrom="column">
-                  <wp:posOffset>1022985</wp:posOffset>
+                  <wp:posOffset>1036955</wp:posOffset>
                 </wp:positionH>
                 <wp:positionV relativeFrom="page">
-                  <wp:posOffset>862965</wp:posOffset>
+                  <wp:posOffset>959485</wp:posOffset>
                 </wp:positionV>
-                <wp:extent cx="5629275" cy="329565"/>
+                <wp:extent cx="5857875" cy="329565"/>
                 <wp:effectExtent l="0" t="0" r="0" b="0"/>
                 <wp:wrapNone/>
                 <wp:docPr id="6" name="组合 6"/>
@@ -448,9 +454,9 @@
                       <wpg:grpSpPr>
                         <a:xfrm>
                           <a:off x="0" y="0"/>
-                          <a:ext cx="5629275" cy="329565"/>
+                          <a:ext cx="5857875" cy="329565"/>
                           <a:chOff x="0" y="-6985"/>
-                          <a:chExt cx="5629275" cy="329565"/>
+                          <a:chExt cx="5857875" cy="329565"/>
                         </a:xfrm>
                       </wpg:grpSpPr>
                       <wps:wsp>
@@ -461,7 +467,7 @@
                         <wps:spPr bwMode="auto">
                           <a:xfrm>
                             <a:off x="47625" y="-6985"/>
-                            <a:ext cx="5581650" cy="329565"/>
+                            <a:ext cx="5810250" cy="329565"/>
                           </a:xfrm>
                           <a:prstGeom prst="rect">
                             <a:avLst/>
@@ -1334,9 +1340,9 @@
           </mc:Choice>
           <mc:Fallback>
             <w:pict>
-              <v:group id="_x0000_s1026" o:spid="_x0000_s1026" o:spt="203" style="position:absolute;left:0pt;margin-left:80.55pt;margin-top:67.95pt;height:25.95pt;width:443.25pt;mso-position-vertical-relative:page;z-index:251664384;mso-width-relative:page;mso-height-relative:page;" coordorigin="0,-6985" coordsize="5629275,329565" o:gfxdata="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">
+              <v:group id="_x0000_s1026" o:spid="_x0000_s1026" o:spt="203" style="position:absolute;left:0pt;margin-left:81.65pt;margin-top:75.55pt;height:25.95pt;width:461.25pt;mso-position-vertical-relative:page;z-index:251664384;mso-width-relative:page;mso-height-relative:page;" coordorigin="0,-6985" coordsize="5857875,329565" o:gfxdata="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">
                 <o:lock v:ext="edit" aspectratio="f"/>
-                <v:shape id="_x0000_s1026" o:spid="_x0000_s1026" o:spt="202" type="#_x0000_t202" style="position:absolute;left:47625;top:-6985;height:329565;width:5581650;" filled="f" stroked="f" coordsize="21600,21600" o:gfxdata="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">
+                <v:shape id="_x0000_s1026" o:spid="_x0000_s1026" o:spt="202" type="#_x0000_t202" style="position:absolute;left:47625;top:-6985;height:329565;width:5810250;" filled="f" stroked="f" coordsize="21600,21600" o:gfxdata="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">
                   <v:fill on="f" focussize="0,0"/>
                   <v:stroke on="f" miterlimit="8" joinstyle="miter"/>
                   <v:imagedata o:title=""/>
@@ -1535,7 +1541,7 @@
                   <wp:posOffset>-28575</wp:posOffset>
                 </wp:positionH>
                 <wp:positionV relativeFrom="paragraph">
-                  <wp:posOffset>99695</wp:posOffset>
+                  <wp:posOffset>137795</wp:posOffset>
                 </wp:positionV>
                 <wp:extent cx="7018020" cy="287655"/>
                 <wp:effectExtent l="0" t="0" r="11430" b="17145"/>
@@ -1673,7 +1679,7 @@
           </mc:Choice>
           <mc:Fallback>
             <w:pict>
-              <v:group id="_x0000_s1026" o:spid="_x0000_s1026" o:spt="203" style="position:absolute;left:0pt;margin-left:-2.25pt;margin-top:7.85pt;height:22.65pt;width:552.6pt;z-index:251660288;mso-width-relative:page;mso-height-relative:page;" coordsize="7018693,252000" o:gfxdata="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">
+              <v:group id="_x0000_s1026" o:spid="_x0000_s1026" o:spt="203" style="position:absolute;left:0pt;margin-left:-2.25pt;margin-top:10.85pt;height:22.65pt;width:552.6pt;z-index:251660288;mso-width-relative:page;mso-height-relative:page;" coordsize="7018693,252000" o:gfxdata="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">
                 <o:lock v:ext="edit" aspectratio="f"/>
                 <v:rect id="_x0000_s1026" o:spid="_x0000_s1026" o:spt="1" style="position:absolute;left:47630;top:0;height:252000;width:6971063;v-text-anchor:middle;" fillcolor="#F2F2F2 [3052]" filled="t" stroked="f" coordsize="21600,21600" o:gfxdata="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">
                   <v:fill on="t" focussize="0,0"/>
@@ -1751,12 +1757,12 @@
               <wp:anchor distT="0" distB="0" distL="114300" distR="114300" simplePos="0" relativeHeight="251661312" behindDoc="0" locked="0" layoutInCell="1" allowOverlap="1">
                 <wp:simplePos x="0" y="0"/>
                 <wp:positionH relativeFrom="column">
-                  <wp:posOffset>13335</wp:posOffset>
+                  <wp:posOffset>54610</wp:posOffset>
                 </wp:positionH>
                 <wp:positionV relativeFrom="paragraph">
-                  <wp:posOffset>76200</wp:posOffset>
+                  <wp:posOffset>106680</wp:posOffset>
                 </wp:positionV>
-                <wp:extent cx="6921500" cy="575310"/>
+                <wp:extent cx="6908165" cy="575310"/>
                 <wp:effectExtent l="0" t="0" r="0" b="0"/>
                 <wp:wrapNone/>
                 <wp:docPr id="9" name="文本框 2"/>
@@ -1770,7 +1776,7 @@
                       <wps:spPr bwMode="auto">
                         <a:xfrm>
                           <a:off x="342900" y="2665730"/>
-                          <a:ext cx="6921500" cy="575310"/>
+                          <a:ext cx="6908165" cy="575310"/>
                         </a:xfrm>
                         <a:prstGeom prst="rect">
                           <a:avLst/>
@@ -2140,7 +2146,7 @@
           </mc:Choice>
           <mc:Fallback>
             <w:pict>
-              <v:shape id="文本框 2" o:spid="_x0000_s1026" o:spt="202" type="#_x0000_t202" style="position:absolute;left:0pt;margin-left:1.05pt;margin-top:6pt;height:45.3pt;width:545pt;z-index:251661312;mso-width-relative:page;mso-height-relative:page;" filled="f" stroked="f" coordsize="21600,21600" o:gfxdata="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">
+              <v:shape id="文本框 2" o:spid="_x0000_s1026" o:spt="202" type="#_x0000_t202" style="position:absolute;left:0pt;margin-left:4.3pt;margin-top:8.4pt;height:45.3pt;width:543.95pt;z-index:251661312;mso-width-relative:page;mso-height-relative:page;" filled="f" stroked="f" coordsize="21600,21600" o:gfxdata="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">
                 <v:fill on="f" focussize="0,0"/>
                 <v:stroke on="f" miterlimit="8" joinstyle="miter"/>
                 <v:imagedata o:title=""/>
@@ -2521,6 +2527,89 @@
           <w:sz w:val="21"/>
         </w:rPr>
         <mc:AlternateContent>
+          <mc:Choice Requires="wps">
+            <w:drawing>
+              <wp:anchor distT="0" distB="0" distL="114300" distR="114300" simplePos="0" relativeHeight="251669504" behindDoc="0" locked="0" layoutInCell="1" allowOverlap="1">
+                <wp:simplePos x="0" y="0"/>
+                <wp:positionH relativeFrom="column">
+                  <wp:posOffset>-33655</wp:posOffset>
+                </wp:positionH>
+                <wp:positionV relativeFrom="paragraph">
+                  <wp:posOffset>2762885</wp:posOffset>
+                </wp:positionV>
+                <wp:extent cx="7330440" cy="787400"/>
+                <wp:effectExtent l="0" t="0" r="0" b="0"/>
+                <wp:wrapNone/>
+                <wp:docPr id="42" name="文本框 2"/>
+                <wp:cNvGraphicFramePr/>
+                <a:graphic xmlns:a="http://schemas.openxmlformats.org/drawingml/2006/main">
+                  <a:graphicData uri="http://schemas.microsoft.com/office/word/2010/wordprocessingShape">
+                    <wps:wsp>
+                      <wps:cNvSpPr txBox="1">
+                        <a:spLocks noChangeArrowheads="1"/>
+                      </wps:cNvSpPr>
+                      <wps:spPr bwMode="auto">
+                        <a:xfrm>
+                          <a:off x="342900" y="7824470"/>
+                          <a:ext cx="7330440" cy="787400"/>
+                        </a:xfrm>
+                        <a:prstGeom prst="rect">
+                          <a:avLst/>
+                        </a:prstGeom>
+                        <a:noFill/>
+                        <a:ln w="9525">
+                          <a:noFill/>
+                          <a:miter lim="800000"/>
+                        </a:ln>
+                      </wps:spPr>
+                      <wps:txbx>
+                        <w:txbxContent>
+                          <w:p/>
+                        </w:txbxContent>
+                      </wps:txbx>
+                      <wps:bodyPr rot="0" vert="horz" wrap="square" lIns="91440" tIns="45720" rIns="91440" bIns="45720" anchor="t" anchorCtr="0">
+                        <a:spAutoFit/>
+                      </wps:bodyPr>
+                    </wps:wsp>
+                  </a:graphicData>
+                </a:graphic>
+              </wp:anchor>
+            </w:drawing>
+          </mc:Choice>
+          <mc:Fallback>
+            <w:pict>
+              <v:shape id="文本框 2" o:spid="_x0000_s1026" o:spt="202" type="#_x0000_t202" style="position:absolute;left:0pt;margin-left:-2.65pt;margin-top:217.55pt;height:62pt;width:577.2pt;z-index:251669504;mso-width-relative:page;mso-height-relative:page;" filled="f" stroked="f" coordsize="21600,21600" o:gfxdata="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">
+                <v:fill on="f" focussize="0,0"/>
+                <v:stroke on="f" miterlimit="8" joinstyle="miter"/>
+                <v:imagedata o:title=""/>
+                <o:lock v:ext="edit" aspectratio="f"/>
+                <v:textbox style="mso-fit-shape-to-text:t;">
+                  <w:txbxContent>
+                    <w:p/>
+                  </w:txbxContent>
+                </v:textbox>
+              </v:shape>
+            </w:pict>
+          </mc:Fallback>
+        </mc:AlternateContent>
+      </w:r>
+    </w:p>
+    <w:p>
+      <w:pPr>
+        <w:bidi w:val="0"/>
+        <w:rPr>
+          <w:rFonts w:asciiTheme="minorHAnsi" w:hAnsiTheme="minorHAnsi" w:eastAsiaTheme="minorEastAsia" w:cstheme="minorBidi"/>
+          <w:kern w:val="2"/>
+          <w:sz w:val="21"/>
+          <w:szCs w:val="22"/>
+          <w:lang w:val="en-US" w:eastAsia="zh-CN" w:bidi="ar-SA"/>
+        </w:rPr>
+      </w:pPr>
+      <w:r>
+        <w:rPr>
+          <w:sz w:val="21"/>
+        </w:rPr>
+        <mc:AlternateContent>
           <mc:Choice Requires="wpg">
             <w:drawing>
               <wp:anchor distT="0" distB="0" distL="114300" distR="114300" simplePos="0" relativeHeight="251666432" behindDoc="0" locked="0" layoutInCell="1" allowOverlap="1">
@@ -2529,7 +2618,7 @@
                   <wp:posOffset>-19050</wp:posOffset>
                 </wp:positionH>
                 <wp:positionV relativeFrom="paragraph">
-                  <wp:posOffset>114935</wp:posOffset>
+                  <wp:posOffset>73660</wp:posOffset>
                 </wp:positionV>
                 <wp:extent cx="7009130" cy="287655"/>
                 <wp:effectExtent l="0" t="0" r="1270" b="17145"/>
@@ -2682,7 +2771,7 @@
           </mc:Choice>
           <mc:Fallback>
             <w:pict>
-              <v:group id="_x0000_s1026" o:spid="_x0000_s1026" o:spt="203" style="position:absolute;left:0pt;margin-left:-1.5pt;margin-top:9.05pt;height:22.65pt;width:551.9pt;z-index:251666432;mso-width-relative:page;mso-height-relative:page;" coordsize="6959632,252000" o:gfxdata="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">
+              <v:group id="_x0000_s1026" o:spid="_x0000_s1026" o:spt="203" style="position:absolute;left:0pt;margin-left:-1.5pt;margin-top:5.8pt;height:22.65pt;width:551.9pt;z-index:251666432;mso-width-relative:page;mso-height-relative:page;" coordsize="6959632,252000" o:gfxdata="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">
                 <o:lock v:ext="edit" aspectratio="f"/>
                 <v:rect id="_x0000_s1026" o:spid="_x0000_s1026" o:spt="1" style="position:absolute;left:47625;top:0;height:252000;width:6912007;v-text-anchor:middle;" fillcolor="#F2F2F2 [3052]" filled="t" stroked="f" coordsize="21600,21600" o:gfxdata="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">
                   <v:fill on="t" focussize="0,0"/>
@@ -2756,90 +2845,9 @@
     </w:p>
     <w:p>
       <w:pPr>
-        <w:adjustRightInd w:val="0"/>
-        <w:snapToGrid w:val="0"/>
-      </w:pPr>
-      <w:r>
-        <w:rPr>
-          <w:sz w:val="21"/>
-        </w:rPr>
-        <mc:AlternateContent>
-          <mc:Choice Requires="wps">
-            <w:drawing>
-              <wp:anchor distT="0" distB="0" distL="114300" distR="114300" simplePos="0" relativeHeight="251669504" behindDoc="0" locked="0" layoutInCell="1" allowOverlap="1">
-                <wp:simplePos x="0" y="0"/>
-                <wp:positionH relativeFrom="column">
-                  <wp:posOffset>-33655</wp:posOffset>
-                </wp:positionH>
-                <wp:positionV relativeFrom="paragraph">
-                  <wp:posOffset>2762885</wp:posOffset>
-                </wp:positionV>
-                <wp:extent cx="7330440" cy="787400"/>
-                <wp:effectExtent l="0" t="0" r="0" b="0"/>
-                <wp:wrapNone/>
-                <wp:docPr id="42" name="文本框 2"/>
-                <wp:cNvGraphicFramePr/>
-                <a:graphic xmlns:a="http://schemas.openxmlformats.org/drawingml/2006/main">
-                  <a:graphicData uri="http://schemas.microsoft.com/office/word/2010/wordprocessingShape">
-                    <wps:wsp>
-                      <wps:cNvSpPr txBox="1">
-                        <a:spLocks noChangeArrowheads="1"/>
-                      </wps:cNvSpPr>
-                      <wps:spPr bwMode="auto">
-                        <a:xfrm>
-                          <a:off x="342900" y="7824470"/>
-                          <a:ext cx="7330440" cy="787400"/>
-                        </a:xfrm>
-                        <a:prstGeom prst="rect">
-                          <a:avLst/>
-                        </a:prstGeom>
-                        <a:noFill/>
-                        <a:ln w="9525">
-                          <a:noFill/>
-                          <a:miter lim="800000"/>
-                        </a:ln>
-                      </wps:spPr>
-                      <wps:txbx>
-                        <w:txbxContent>
-                          <w:p/>
-                        </w:txbxContent>
-                      </wps:txbx>
-                      <wps:bodyPr rot="0" vert="horz" wrap="square" lIns="91440" tIns="45720" rIns="91440" bIns="45720" anchor="t" anchorCtr="0">
-                        <a:spAutoFit/>
-                      </wps:bodyPr>
-                    </wps:wsp>
-                  </a:graphicData>
-                </a:graphic>
-              </wp:anchor>
-            </w:drawing>
-          </mc:Choice>
-          <mc:Fallback>
-            <w:pict>
-              <v:shape id="文本框 2" o:spid="_x0000_s1026" o:spt="202" type="#_x0000_t202" style="position:absolute;left:0pt;margin-left:-2.65pt;margin-top:217.55pt;height:62pt;width:577.2pt;z-index:251669504;mso-width-relative:page;mso-height-relative:page;" filled="f" stroked="f" coordsize="21600,21600" o:gfxdata="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">
-                <v:fill on="f" focussize="0,0"/>
-                <v:stroke on="f" miterlimit="8" joinstyle="miter"/>
-                <v:imagedata o:title=""/>
-                <o:lock v:ext="edit" aspectratio="f"/>
-                <v:textbox style="mso-fit-shape-to-text:t;">
-                  <w:txbxContent>
-                    <w:p/>
-                  </w:txbxContent>
-                </v:textbox>
-              </v:shape>
-            </w:pict>
-          </mc:Fallback>
-        </mc:AlternateContent>
-      </w:r>
-    </w:p>
-    <w:p>
-      <w:pPr>
         <w:bidi w:val="0"/>
         <w:rPr>
-          <w:rFonts w:asciiTheme="minorHAnsi" w:hAnsiTheme="minorHAnsi" w:eastAsiaTheme="minorEastAsia" w:cstheme="minorBidi"/>
-          <w:kern w:val="2"/>
-          <w:sz w:val="21"/>
-          <w:szCs w:val="22"/>
-          <w:lang w:val="en-US" w:eastAsia="zh-CN" w:bidi="ar-SA"/>
+          <w:lang w:val="en-US" w:eastAsia="zh-CN"/>
         </w:rPr>
       </w:pPr>
       <w:r>
@@ -2852,12 +2860,12 @@
               <wp:anchor distT="0" distB="0" distL="114300" distR="114300" simplePos="0" relativeHeight="251667456" behindDoc="0" locked="0" layoutInCell="1" allowOverlap="1">
                 <wp:simplePos x="0" y="0"/>
                 <wp:positionH relativeFrom="column">
-                  <wp:posOffset>-53975</wp:posOffset>
+                  <wp:posOffset>70485</wp:posOffset>
                 </wp:positionH>
                 <wp:positionV relativeFrom="paragraph">
-                  <wp:posOffset>69850</wp:posOffset>
+                  <wp:posOffset>176530</wp:posOffset>
                 </wp:positionV>
-                <wp:extent cx="6921500" cy="1443355"/>
+                <wp:extent cx="6921500" cy="1042670"/>
                 <wp:effectExtent l="0" t="0" r="0" b="0"/>
                 <wp:wrapNone/>
                 <wp:docPr id="30" name="文本框 2"/>
@@ -2871,7 +2879,7 @@
                       <wps:spPr bwMode="auto">
                         <a:xfrm>
                           <a:off x="342900" y="4411980"/>
-                          <a:ext cx="6921500" cy="1443355"/>
+                          <a:ext cx="6921500" cy="1042670"/>
                         </a:xfrm>
                         <a:prstGeom prst="rect">
                           <a:avLst/>
@@ -3069,7 +3077,7 @@
           </mc:Choice>
           <mc:Fallback>
             <w:pict>
-              <v:shape id="文本框 2" o:spid="_x0000_s1026" o:spt="202" type="#_x0000_t202" style="position:absolute;left:0pt;margin-left:-4.25pt;margin-top:5.5pt;height:113.65pt;width:545pt;z-index:251667456;mso-width-relative:page;mso-height-relative:page;" filled="f" stroked="f" coordsize="21600,21600" o:gfxdata="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">
+              <v:shape id="文本框 2" o:spid="_x0000_s1026" o:spt="202" type="#_x0000_t202" style="position:absolute;left:0pt;margin-left:5.55pt;margin-top:13.9pt;height:82.1pt;width:545pt;z-index:251667456;mso-width-relative:page;mso-height-relative:page;" filled="f" stroked="f" coordsize="21600,21600" o:gfxdata="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">
                 <v:fill on="f" focussize="0,0"/>
                 <v:stroke on="f" miterlimit="8" joinstyle="miter"/>
                 <v:imagedata o:title=""/>
@@ -3255,6 +3263,14 @@
           </mc:Fallback>
         </mc:AlternateContent>
       </w:r>
+    </w:p>
+    <w:p>
+      <w:pPr>
+        <w:bidi w:val="0"/>
+        <w:rPr>
+          <w:lang w:val="en-US" w:eastAsia="zh-CN"/>
+        </w:rPr>
+      </w:pPr>
     </w:p>
     <w:p>
       <w:pPr>
@@ -3308,7 +3324,7 @@
                   <wp:posOffset>2540</wp:posOffset>
                 </wp:positionH>
                 <wp:positionV relativeFrom="paragraph">
-                  <wp:posOffset>187960</wp:posOffset>
+                  <wp:posOffset>34290</wp:posOffset>
                 </wp:positionV>
                 <wp:extent cx="7009130" cy="287655"/>
                 <wp:effectExtent l="0" t="0" r="1270" b="1905"/>
@@ -3461,7 +3477,7 @@
           </mc:Choice>
           <mc:Fallback>
             <w:pict>
-              <v:group id="_x0000_s1026" o:spid="_x0000_s1026" o:spt="203" style="position:absolute;left:0pt;margin-left:0.2pt;margin-top:14.8pt;height:22.65pt;width:551.9pt;z-index:251672576;mso-width-relative:page;mso-height-relative:page;" coordsize="6959632,252000" o:gfxdata="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">
+              <v:group id="_x0000_s1026" o:spid="_x0000_s1026" o:spt="203" style="position:absolute;left:0pt;margin-left:0.2pt;margin-top:2.7pt;height:22.65pt;width:551.9pt;z-index:251672576;mso-width-relative:page;mso-height-relative:page;" coordsize="6959632,252000" o:gfxdata="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">
                 <o:lock v:ext="edit" aspectratio="f"/>
                 <v:rect id="矩形 26" o:spid="_x0000_s1026" o:spt="1" style="position:absolute;left:47625;top:0;height:252000;width:6912007;v-text-anchor:middle;" fillcolor="#F2F2F2 [3052]" filled="t" stroked="f" coordsize="21600,21600" o:gfxdata="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">
                   <v:fill on="t" focussize="0,0"/>
@@ -3535,506 +3551,22 @@
     </w:p>
     <w:p>
       <w:pPr>
-        <w:bidi w:val="0"/>
+        <w:keepNext w:val="0"/>
+        <w:keepLines w:val="0"/>
+        <w:widowControl/>
+        <w:suppressLineNumbers w:val="0"/>
+        <w:jc w:val="left"/>
         <w:rPr>
-          <w:lang w:val="en-US" w:eastAsia="zh-CN"/>
+          <w:rFonts w:hint="eastAsia" w:ascii="微软雅黑" w:hAnsi="微软雅黑" w:eastAsia="微软雅黑" w:cs="微软雅黑"/>
+          <w:b/>
+          <w:bCs/>
+          <w:color w:val="0F27AE"/>
+          <w:kern w:val="0"/>
+          <w:sz w:val="21"/>
+          <w:szCs w:val="21"/>
+          <w:lang w:val="en-US" w:eastAsia="zh-CN" w:bidi="ar"/>
         </w:rPr>
       </w:pPr>
-    </w:p>
-    <w:p>
-      <w:pPr>
-        <w:bidi w:val="0"/>
-        <w:rPr>
-          <w:lang w:val="en-US" w:eastAsia="zh-CN"/>
-        </w:rPr>
-      </w:pPr>
-      <w:r>
-        <w:rPr>
-          <w:sz w:val="21"/>
-        </w:rPr>
-        <mc:AlternateContent>
-          <mc:Choice Requires="wps">
-            <w:drawing>
-              <wp:anchor distT="0" distB="0" distL="114300" distR="114300" simplePos="0" relativeHeight="251673600" behindDoc="0" locked="0" layoutInCell="1" allowOverlap="1">
-                <wp:simplePos x="0" y="0"/>
-                <wp:positionH relativeFrom="column">
-                  <wp:posOffset>27305</wp:posOffset>
-                </wp:positionH>
-                <wp:positionV relativeFrom="paragraph">
-                  <wp:posOffset>480695</wp:posOffset>
-                </wp:positionV>
-                <wp:extent cx="6979920" cy="1905635"/>
-                <wp:effectExtent l="0" t="0" r="0" b="0"/>
-                <wp:wrapNone/>
-                <wp:docPr id="17" name="文本框 2"/>
-                <wp:cNvGraphicFramePr/>
-                <a:graphic xmlns:a="http://schemas.openxmlformats.org/drawingml/2006/main">
-                  <a:graphicData uri="http://schemas.microsoft.com/office/word/2010/wordprocessingShape">
-                    <wps:wsp>
-                      <wps:cNvSpPr txBox="1">
-                        <a:spLocks noChangeArrowheads="1"/>
-                      </wps:cNvSpPr>
-                      <wps:spPr bwMode="auto">
-                        <a:xfrm>
-                          <a:off x="0" y="0"/>
-                          <a:ext cx="6979920" cy="1905635"/>
-                        </a:xfrm>
-                        <a:prstGeom prst="rect">
-                          <a:avLst/>
-                        </a:prstGeom>
-                        <a:noFill/>
-                        <a:ln w="9525">
-                          <a:noFill/>
-                          <a:miter lim="800000"/>
-                        </a:ln>
-                      </wps:spPr>
-                      <wps:txbx>
-                        <w:txbxContent>
-                          <w:p>
-                            <w:pPr>
-                              <w:numPr>
-                                <w:ilvl w:val="0"/>
-                                <w:numId w:val="0"/>
-                              </w:numPr>
-                              <w:adjustRightInd w:val="0"/>
-                              <w:snapToGrid w:val="0"/>
-                              <w:ind w:leftChars="0"/>
-                              <w:rPr>
-                                <w:rFonts w:hint="eastAsia" w:ascii="微软雅黑" w:hAnsi="微软雅黑" w:eastAsia="微软雅黑" w:cs="微软雅黑"/>
-                                <w:b w:val="0"/>
-                                <w:bCs w:val="0"/>
-                                <w:color w:val="555555"/>
-                                <w:kern w:val="0"/>
-                                <w:sz w:val="21"/>
-                                <w:szCs w:val="21"/>
-                                <w:lang w:val="en-US" w:eastAsia="zh-CN" w:bidi="ar"/>
-                              </w:rPr>
-                            </w:pPr>
-                            <w:r>
-                              <w:rPr>
-                                <w:rFonts w:hint="eastAsia" w:ascii="微软雅黑" w:hAnsi="微软雅黑" w:eastAsia="微软雅黑" w:cs="微软雅黑"/>
-                                <w:b/>
-                                <w:bCs/>
-                                <w:color w:val="555555"/>
-                                <w:kern w:val="0"/>
-                                <w:sz w:val="21"/>
-                                <w:szCs w:val="21"/>
-                                <w:lang w:val="en-US" w:eastAsia="zh-CN" w:bidi="ar"/>
-                              </w:rPr>
-                              <w:t>双端交付：</w:t>
-                            </w:r>
-                            <w:r>
-                              <w:rPr>
-                                <w:rFonts w:hint="eastAsia" w:ascii="微软雅黑" w:hAnsi="微软雅黑" w:eastAsia="微软雅黑" w:cs="微软雅黑"/>
-                                <w:b w:val="0"/>
-                                <w:bCs w:val="0"/>
-                                <w:color w:val="555555"/>
-                                <w:kern w:val="0"/>
-                                <w:sz w:val="21"/>
-                                <w:szCs w:val="21"/>
-                                <w:lang w:val="en-US" w:eastAsia="zh-CN" w:bidi="ar"/>
-                              </w:rPr>
-                              <w:t>参与商旅 C 端预订链路（小程序/H5 直触用户）与 B 端配置中台 双线开发，累计交付 20+ 项需求/特性，随 15 次 release 上线。</w:t>
-                            </w:r>
-                          </w:p>
-                          <w:p>
-                            <w:pPr>
-                              <w:numPr>
-                                <w:ilvl w:val="0"/>
-                                <w:numId w:val="0"/>
-                              </w:numPr>
-                              <w:adjustRightInd w:val="0"/>
-                              <w:snapToGrid w:val="0"/>
-                              <w:ind w:leftChars="0"/>
-                              <w:rPr>
-                                <w:rFonts w:hint="default" w:ascii="微软雅黑" w:hAnsi="微软雅黑" w:eastAsia="微软雅黑" w:cs="微软雅黑"/>
-                                <w:b w:val="0"/>
-                                <w:bCs w:val="0"/>
-                                <w:color w:val="555555"/>
-                                <w:kern w:val="0"/>
-                                <w:sz w:val="21"/>
-                                <w:szCs w:val="21"/>
-                                <w:lang w:val="en-US" w:eastAsia="zh-CN" w:bidi="ar"/>
-                              </w:rPr>
-                            </w:pPr>
-                            <w:r>
-                              <w:rPr>
-                                <w:rFonts w:hint="default" w:ascii="微软雅黑" w:hAnsi="微软雅黑" w:eastAsia="微软雅黑" w:cs="微软雅黑"/>
-                                <w:b/>
-                                <w:bCs/>
-                                <w:color w:val="555555"/>
-                                <w:kern w:val="0"/>
-                                <w:sz w:val="21"/>
-                                <w:szCs w:val="21"/>
-                                <w:lang w:val="en-US" w:eastAsia="zh-CN" w:bidi="ar"/>
-                              </w:rPr>
-                              <w:t>性能与体验优化</w:t>
-                            </w:r>
-                            <w:r>
-                              <w:rPr>
-                                <w:rFonts w:hint="default" w:ascii="微软雅黑" w:hAnsi="微软雅黑" w:eastAsia="微软雅黑" w:cs="微软雅黑"/>
-                                <w:b w:val="0"/>
-                                <w:bCs w:val="0"/>
-                                <w:color w:val="555555"/>
-                                <w:kern w:val="0"/>
-                                <w:sz w:val="21"/>
-                                <w:szCs w:val="21"/>
-                                <w:lang w:val="en-US" w:eastAsia="zh-CN" w:bidi="ar"/>
-                              </w:rPr>
-                              <w:t>：针对商旅 H5/小程序首屏与列表渲染做懒加载、资源拆分与关键接口并行请求优化，缩短核心预订页加载时间，提升弱网环境下的可操作性与转化体验。</w:t>
-                            </w:r>
-                          </w:p>
-                          <w:p>
-                            <w:pPr>
-                              <w:numPr>
-                                <w:ilvl w:val="0"/>
-                                <w:numId w:val="0"/>
-                              </w:numPr>
-                              <w:adjustRightInd w:val="0"/>
-                              <w:snapToGrid w:val="0"/>
-                              <w:ind w:leftChars="0"/>
-                              <w:rPr>
-                                <w:rFonts w:hint="default" w:ascii="微软雅黑" w:hAnsi="微软雅黑" w:eastAsia="微软雅黑" w:cs="微软雅黑"/>
-                                <w:b w:val="0"/>
-                                <w:bCs w:val="0"/>
-                                <w:color w:val="555555"/>
-                                <w:kern w:val="0"/>
-                                <w:sz w:val="21"/>
-                                <w:szCs w:val="21"/>
-                                <w:lang w:val="en-US" w:eastAsia="zh-CN" w:bidi="ar"/>
-                              </w:rPr>
-                            </w:pPr>
-                            <w:r>
-                              <w:rPr>
-                                <w:rFonts w:hint="default" w:ascii="微软雅黑" w:hAnsi="微软雅黑" w:eastAsia="微软雅黑" w:cs="微软雅黑"/>
-                                <w:b/>
-                                <w:bCs/>
-                                <w:color w:val="555555"/>
-                                <w:kern w:val="0"/>
-                                <w:sz w:val="21"/>
-                                <w:szCs w:val="21"/>
-                                <w:lang w:val="en-US" w:eastAsia="zh-CN" w:bidi="ar"/>
-                              </w:rPr>
-                              <w:t>组件与质量保障</w:t>
-                            </w:r>
-                            <w:r>
-                              <w:rPr>
-                                <w:rFonts w:hint="default" w:ascii="微软雅黑" w:hAnsi="微软雅黑" w:eastAsia="微软雅黑" w:cs="微软雅黑"/>
-                                <w:b w:val="0"/>
-                                <w:bCs w:val="0"/>
-                                <w:color w:val="555555"/>
-                                <w:kern w:val="0"/>
-                                <w:sz w:val="21"/>
-                                <w:szCs w:val="21"/>
-                                <w:lang w:val="en-US" w:eastAsia="zh-CN" w:bidi="ar"/>
-                              </w:rPr>
-                              <w:t>：沉淀表单、列表、配置编辑等通用业务组件，减少 C/B 端重复开发；缩短单需求从理解到落地的周期，提升并行需求下的交付效率。</w:t>
-                            </w:r>
-                          </w:p>
-                          <w:p>
-                            <w:pPr>
-                              <w:numPr>
-                                <w:ilvl w:val="0"/>
-                                <w:numId w:val="0"/>
-                              </w:numPr>
-                              <w:adjustRightInd w:val="0"/>
-                              <w:snapToGrid w:val="0"/>
-                              <w:ind w:leftChars="0"/>
-                              <w:rPr>
-                                <w:rFonts w:hint="eastAsia" w:ascii="微软雅黑" w:hAnsi="微软雅黑" w:eastAsia="微软雅黑" w:cs="微软雅黑"/>
-                                <w:b w:val="0"/>
-                                <w:bCs w:val="0"/>
-                                <w:color w:val="555555"/>
-                                <w:kern w:val="0"/>
-                                <w:sz w:val="21"/>
-                                <w:szCs w:val="21"/>
-                                <w:lang w:val="en-US" w:eastAsia="zh-CN" w:bidi="ar"/>
-                              </w:rPr>
-                            </w:pPr>
-                            <w:r>
-                              <w:rPr>
-                                <w:rFonts w:hint="eastAsia" w:ascii="微软雅黑" w:hAnsi="微软雅黑" w:eastAsia="微软雅黑" w:cs="微软雅黑"/>
-                                <w:b/>
-                                <w:bCs/>
-                                <w:color w:val="555555"/>
-                                <w:kern w:val="0"/>
-                                <w:sz w:val="21"/>
-                                <w:szCs w:val="21"/>
-                                <w:lang w:val="en-US" w:eastAsia="zh-CN" w:bidi="ar"/>
-                              </w:rPr>
-                              <w:t>AI 协同研发</w:t>
-                            </w:r>
-                            <w:r>
-                              <w:rPr>
-                                <w:rFonts w:hint="eastAsia" w:ascii="微软雅黑" w:hAnsi="微软雅黑" w:eastAsia="微软雅黑" w:cs="微软雅黑"/>
-                                <w:b w:val="0"/>
-                                <w:bCs w:val="0"/>
-                                <w:color w:val="555555"/>
-                                <w:kern w:val="0"/>
-                                <w:sz w:val="21"/>
-                                <w:szCs w:val="21"/>
-                                <w:lang w:val="en-US" w:eastAsia="zh-CN" w:bidi="ar"/>
-                              </w:rPr>
-                              <w:t>：使用 Cooper、工作流 Skill 及页面脚手架串联需求分析、方案输出、开发实现与质量检查；在 AI 提效基础上，个人承担代码规范、CR 与发版把关，确保交付质量可控。</w:t>
-                            </w:r>
-                          </w:p>
-                          <w:p>
-                            <w:pPr>
-                              <w:numPr>
-                                <w:ilvl w:val="0"/>
-                                <w:numId w:val="0"/>
-                              </w:numPr>
-                              <w:adjustRightInd w:val="0"/>
-                              <w:snapToGrid w:val="0"/>
-                              <w:ind w:leftChars="0"/>
-                              <w:rPr>
-                                <w:rFonts w:hint="eastAsia" w:ascii="微软雅黑" w:hAnsi="微软雅黑" w:eastAsia="微软雅黑" w:cs="微软雅黑"/>
-                                <w:b/>
-                                <w:bCs/>
-                                <w:color w:val="555555"/>
-                                <w:kern w:val="0"/>
-                                <w:sz w:val="21"/>
-                                <w:szCs w:val="21"/>
-                                <w:lang w:val="en-US" w:eastAsia="zh-CN" w:bidi="ar"/>
-                              </w:rPr>
-                            </w:pPr>
-                          </w:p>
-                        </w:txbxContent>
-                      </wps:txbx>
-                      <wps:bodyPr rot="0" vert="horz" wrap="square" lIns="91440" tIns="45720" rIns="91440" bIns="45720" anchor="t" anchorCtr="0">
-                        <a:noAutofit/>
-                      </wps:bodyPr>
-                    </wps:wsp>
-                  </a:graphicData>
-                </a:graphic>
-              </wp:anchor>
-            </w:drawing>
-          </mc:Choice>
-          <mc:Fallback>
-            <w:pict>
-              <v:shape id="文本框 2" o:spid="_x0000_s1026" o:spt="202" type="#_x0000_t202" style="position:absolute;left:0pt;margin-left:2.15pt;margin-top:37.85pt;height:150.05pt;width:549.6pt;z-index:251673600;mso-width-relative:page;mso-height-relative:page;" filled="f" stroked="f" coordsize="21600,21600" o:gfxdata="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">
-                <v:fill on="f" focussize="0,0"/>
-                <v:stroke on="f" miterlimit="8" joinstyle="miter"/>
-                <v:imagedata o:title=""/>
-                <o:lock v:ext="edit" aspectratio="f"/>
-                <v:textbox>
-                  <w:txbxContent>
-                    <w:p>
-                      <w:pPr>
-                        <w:numPr>
-                          <w:ilvl w:val="0"/>
-                          <w:numId w:val="0"/>
-                        </w:numPr>
-                        <w:adjustRightInd w:val="0"/>
-                        <w:snapToGrid w:val="0"/>
-                        <w:ind w:leftChars="0"/>
-                        <w:rPr>
-                          <w:rFonts w:hint="eastAsia" w:ascii="微软雅黑" w:hAnsi="微软雅黑" w:eastAsia="微软雅黑" w:cs="微软雅黑"/>
-                          <w:b w:val="0"/>
-                          <w:bCs w:val="0"/>
-                          <w:color w:val="555555"/>
-                          <w:kern w:val="0"/>
-                          <w:sz w:val="21"/>
-                          <w:szCs w:val="21"/>
-                          <w:lang w:val="en-US" w:eastAsia="zh-CN" w:bidi="ar"/>
-                        </w:rPr>
-                      </w:pPr>
-                      <w:r>
-                        <w:rPr>
-                          <w:rFonts w:hint="eastAsia" w:ascii="微软雅黑" w:hAnsi="微软雅黑" w:eastAsia="微软雅黑" w:cs="微软雅黑"/>
-                          <w:b/>
-                          <w:bCs/>
-                          <w:color w:val="555555"/>
-                          <w:kern w:val="0"/>
-                          <w:sz w:val="21"/>
-                          <w:szCs w:val="21"/>
-                          <w:lang w:val="en-US" w:eastAsia="zh-CN" w:bidi="ar"/>
-                        </w:rPr>
-                        <w:t>双端交付：</w:t>
-                      </w:r>
-                      <w:r>
-                        <w:rPr>
-                          <w:rFonts w:hint="eastAsia" w:ascii="微软雅黑" w:hAnsi="微软雅黑" w:eastAsia="微软雅黑" w:cs="微软雅黑"/>
-                          <w:b w:val="0"/>
-                          <w:bCs w:val="0"/>
-                          <w:color w:val="555555"/>
-                          <w:kern w:val="0"/>
-                          <w:sz w:val="21"/>
-                          <w:szCs w:val="21"/>
-                          <w:lang w:val="en-US" w:eastAsia="zh-CN" w:bidi="ar"/>
-                        </w:rPr>
-                        <w:t>参与商旅 C 端预订链路（小程序/H5 直触用户）与 B 端配置中台 双线开发，累计交付 20+ 项需求/特性，随 15 次 release 上线。</w:t>
-                      </w:r>
-                    </w:p>
-                    <w:p>
-                      <w:pPr>
-                        <w:numPr>
-                          <w:ilvl w:val="0"/>
-                          <w:numId w:val="0"/>
-                        </w:numPr>
-                        <w:adjustRightInd w:val="0"/>
-                        <w:snapToGrid w:val="0"/>
-                        <w:ind w:leftChars="0"/>
-                        <w:rPr>
-                          <w:rFonts w:hint="default" w:ascii="微软雅黑" w:hAnsi="微软雅黑" w:eastAsia="微软雅黑" w:cs="微软雅黑"/>
-                          <w:b w:val="0"/>
-                          <w:bCs w:val="0"/>
-                          <w:color w:val="555555"/>
-                          <w:kern w:val="0"/>
-                          <w:sz w:val="21"/>
-                          <w:szCs w:val="21"/>
-                          <w:lang w:val="en-US" w:eastAsia="zh-CN" w:bidi="ar"/>
-                        </w:rPr>
-                      </w:pPr>
-                      <w:r>
-                        <w:rPr>
-                          <w:rFonts w:hint="default" w:ascii="微软雅黑" w:hAnsi="微软雅黑" w:eastAsia="微软雅黑" w:cs="微软雅黑"/>
-                          <w:b/>
-                          <w:bCs/>
-                          <w:color w:val="555555"/>
-                          <w:kern w:val="0"/>
-                          <w:sz w:val="21"/>
-                          <w:szCs w:val="21"/>
-                          <w:lang w:val="en-US" w:eastAsia="zh-CN" w:bidi="ar"/>
-                        </w:rPr>
-                        <w:t>性能与体验优化</w:t>
-                      </w:r>
-                      <w:r>
-                        <w:rPr>
-                          <w:rFonts w:hint="default" w:ascii="微软雅黑" w:hAnsi="微软雅黑" w:eastAsia="微软雅黑" w:cs="微软雅黑"/>
-                          <w:b w:val="0"/>
-                          <w:bCs w:val="0"/>
-                          <w:color w:val="555555"/>
-                          <w:kern w:val="0"/>
-                          <w:sz w:val="21"/>
-                          <w:szCs w:val="21"/>
-                          <w:lang w:val="en-US" w:eastAsia="zh-CN" w:bidi="ar"/>
-                        </w:rPr>
-                        <w:t>：针对商旅 H5/小程序首屏与列表渲染做懒加载、资源拆分与关键接口并行请求优化，缩短核心预订页加载时间，提升弱网环境下的可操作性与转化体验。</w:t>
-                      </w:r>
-                    </w:p>
-                    <w:p>
-                      <w:pPr>
-                        <w:numPr>
-                          <w:ilvl w:val="0"/>
-                          <w:numId w:val="0"/>
-                        </w:numPr>
-                        <w:adjustRightInd w:val="0"/>
-                        <w:snapToGrid w:val="0"/>
-                        <w:ind w:leftChars="0"/>
-                        <w:rPr>
-                          <w:rFonts w:hint="default" w:ascii="微软雅黑" w:hAnsi="微软雅黑" w:eastAsia="微软雅黑" w:cs="微软雅黑"/>
-                          <w:b w:val="0"/>
-                          <w:bCs w:val="0"/>
-                          <w:color w:val="555555"/>
-                          <w:kern w:val="0"/>
-                          <w:sz w:val="21"/>
-                          <w:szCs w:val="21"/>
-                          <w:lang w:val="en-US" w:eastAsia="zh-CN" w:bidi="ar"/>
-                        </w:rPr>
-                      </w:pPr>
-                      <w:r>
-                        <w:rPr>
-                          <w:rFonts w:hint="default" w:ascii="微软雅黑" w:hAnsi="微软雅黑" w:eastAsia="微软雅黑" w:cs="微软雅黑"/>
-                          <w:b/>
-                          <w:bCs/>
-                          <w:color w:val="555555"/>
-                          <w:kern w:val="0"/>
-                          <w:sz w:val="21"/>
-                          <w:szCs w:val="21"/>
-                          <w:lang w:val="en-US" w:eastAsia="zh-CN" w:bidi="ar"/>
-                        </w:rPr>
-                        <w:t>组件与质量保障</w:t>
-                      </w:r>
-                      <w:r>
-                        <w:rPr>
-                          <w:rFonts w:hint="default" w:ascii="微软雅黑" w:hAnsi="微软雅黑" w:eastAsia="微软雅黑" w:cs="微软雅黑"/>
-                          <w:b w:val="0"/>
-                          <w:bCs w:val="0"/>
-                          <w:color w:val="555555"/>
-                          <w:kern w:val="0"/>
-                          <w:sz w:val="21"/>
-                          <w:szCs w:val="21"/>
-                          <w:lang w:val="en-US" w:eastAsia="zh-CN" w:bidi="ar"/>
-                        </w:rPr>
-                        <w:t>：沉淀表单、列表、配置编辑等通用业务组件，减少 C/B 端重复开发；缩短单需求从理解到落地的周期，提升并行需求下的交付效率。</w:t>
-                      </w:r>
-                    </w:p>
-                    <w:p>
-                      <w:pPr>
-                        <w:numPr>
-                          <w:ilvl w:val="0"/>
-                          <w:numId w:val="0"/>
-                        </w:numPr>
-                        <w:adjustRightInd w:val="0"/>
-                        <w:snapToGrid w:val="0"/>
-                        <w:ind w:leftChars="0"/>
-                        <w:rPr>
-                          <w:rFonts w:hint="eastAsia" w:ascii="微软雅黑" w:hAnsi="微软雅黑" w:eastAsia="微软雅黑" w:cs="微软雅黑"/>
-                          <w:b w:val="0"/>
-                          <w:bCs w:val="0"/>
-                          <w:color w:val="555555"/>
-                          <w:kern w:val="0"/>
-                          <w:sz w:val="21"/>
-                          <w:szCs w:val="21"/>
-                          <w:lang w:val="en-US" w:eastAsia="zh-CN" w:bidi="ar"/>
-                        </w:rPr>
-                      </w:pPr>
-                      <w:r>
-                        <w:rPr>
-                          <w:rFonts w:hint="eastAsia" w:ascii="微软雅黑" w:hAnsi="微软雅黑" w:eastAsia="微软雅黑" w:cs="微软雅黑"/>
-                          <w:b/>
-                          <w:bCs/>
-                          <w:color w:val="555555"/>
-                          <w:kern w:val="0"/>
-                          <w:sz w:val="21"/>
-                          <w:szCs w:val="21"/>
-                          <w:lang w:val="en-US" w:eastAsia="zh-CN" w:bidi="ar"/>
-                        </w:rPr>
-                        <w:t>AI 协同研发</w:t>
-                      </w:r>
-                      <w:r>
-                        <w:rPr>
-                          <w:rFonts w:hint="eastAsia" w:ascii="微软雅黑" w:hAnsi="微软雅黑" w:eastAsia="微软雅黑" w:cs="微软雅黑"/>
-                          <w:b w:val="0"/>
-                          <w:bCs w:val="0"/>
-                          <w:color w:val="555555"/>
-                          <w:kern w:val="0"/>
-                          <w:sz w:val="21"/>
-                          <w:szCs w:val="21"/>
-                          <w:lang w:val="en-US" w:eastAsia="zh-CN" w:bidi="ar"/>
-                        </w:rPr>
-                        <w:t>：使用 Cooper、工作流 Skill 及页面脚手架串联需求分析、方案输出、开发实现与质量检查；在 AI 提效基础上，个人承担代码规范、CR 与发版把关，确保交付质量可控。</w:t>
-                      </w:r>
-                    </w:p>
-                    <w:p>
-                      <w:pPr>
-                        <w:numPr>
-                          <w:ilvl w:val="0"/>
-                          <w:numId w:val="0"/>
-                        </w:numPr>
-                        <w:adjustRightInd w:val="0"/>
-                        <w:snapToGrid w:val="0"/>
-                        <w:ind w:leftChars="0"/>
-                        <w:rPr>
-                          <w:rFonts w:hint="eastAsia" w:ascii="微软雅黑" w:hAnsi="微软雅黑" w:eastAsia="微软雅黑" w:cs="微软雅黑"/>
-                          <w:b/>
-                          <w:bCs/>
-                          <w:color w:val="555555"/>
-                          <w:kern w:val="0"/>
-                          <w:sz w:val="21"/>
-                          <w:szCs w:val="21"/>
-                          <w:lang w:val="en-US" w:eastAsia="zh-CN" w:bidi="ar"/>
-                        </w:rPr>
-                      </w:pPr>
-                    </w:p>
-                  </w:txbxContent>
-                </v:textbox>
-              </v:shape>
-            </w:pict>
-          </mc:Fallback>
-        </mc:AlternateContent>
-      </w:r>
       <w:r>
         <w:rPr>
           <w:sz w:val="21"/>
@@ -4045,10 +3577,10 @@
               <wp:anchor distT="0" distB="0" distL="114300" distR="114300" simplePos="0" relativeHeight="251659264" behindDoc="0" locked="0" layoutInCell="1" allowOverlap="1">
                 <wp:simplePos x="0" y="0"/>
                 <wp:positionH relativeFrom="column">
-                  <wp:posOffset>-77470</wp:posOffset>
+                  <wp:posOffset>-84455</wp:posOffset>
                 </wp:positionH>
                 <wp:positionV relativeFrom="page">
-                  <wp:posOffset>3847465</wp:posOffset>
+                  <wp:posOffset>4055745</wp:posOffset>
                 </wp:positionV>
                 <wp:extent cx="7099935" cy="468630"/>
                 <wp:effectExtent l="0" t="0" r="1905" b="3810"/>
@@ -4138,7 +3670,7 @@
           </mc:Choice>
           <mc:Fallback>
             <w:pict>
-              <v:shape id="_x0000_s1026" o:spid="_x0000_s1026" o:spt="202" type="#_x0000_t202" style="position:absolute;left:0pt;margin-left:-6.1pt;margin-top:302.95pt;height:36.9pt;width:559.05pt;mso-position-vertical-relative:page;mso-wrap-distance-bottom:0pt;mso-wrap-distance-left:9pt;mso-wrap-distance-right:9pt;mso-wrap-distance-top:0pt;z-index:251659264;mso-width-relative:page;mso-height-relative:page;" filled="f" stroked="f" coordsize="21600,21600" o:gfxdata="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">
+              <v:shape id="_x0000_s1026" o:spid="_x0000_s1026" o:spt="202" type="#_x0000_t202" style="position:absolute;left:0pt;margin-left:-6.65pt;margin-top:319.35pt;height:36.9pt;width:559.05pt;mso-position-vertical-relative:page;mso-wrap-distance-bottom:0pt;mso-wrap-distance-left:9pt;mso-wrap-distance-right:9pt;mso-wrap-distance-top:0pt;z-index:251659264;mso-width-relative:page;mso-height-relative:page;" filled="f" stroked="f" coordsize="21600,21600" o:gfxdata="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">
                 <v:fill on="f" focussize="0,0"/>
                 <v:stroke on="f" weight="0.5pt"/>
                 <v:imagedata o:title=""/>
@@ -4190,25 +3722,493 @@
           </mc:Fallback>
         </mc:AlternateContent>
       </w:r>
-    </w:p>
-    <w:p>
-      <w:pPr>
-        <w:keepNext w:val="0"/>
-        <w:keepLines w:val="0"/>
-        <w:widowControl/>
-        <w:suppressLineNumbers w:val="0"/>
-        <w:jc w:val="left"/>
+      <w:r>
         <w:rPr>
-          <w:rFonts w:hint="eastAsia" w:ascii="微软雅黑" w:hAnsi="微软雅黑" w:eastAsia="微软雅黑" w:cs="微软雅黑"/>
-          <w:b/>
-          <w:bCs/>
-          <w:color w:val="0F27AE"/>
-          <w:kern w:val="0"/>
           <w:sz w:val="21"/>
-          <w:szCs w:val="21"/>
-          <w:lang w:val="en-US" w:eastAsia="zh-CN" w:bidi="ar"/>
         </w:rPr>
-      </w:pPr>
+        <mc:AlternateContent>
+          <mc:Choice Requires="wps">
+            <w:drawing>
+              <wp:anchor distT="0" distB="0" distL="114300" distR="114300" simplePos="0" relativeHeight="251673600" behindDoc="0" locked="0" layoutInCell="1" allowOverlap="1">
+                <wp:simplePos x="0" y="0"/>
+                <wp:positionH relativeFrom="column">
+                  <wp:posOffset>54610</wp:posOffset>
+                </wp:positionH>
+                <wp:positionV relativeFrom="paragraph">
+                  <wp:posOffset>445770</wp:posOffset>
+                </wp:positionV>
+                <wp:extent cx="6979920" cy="1905635"/>
+                <wp:effectExtent l="0" t="0" r="0" b="0"/>
+                <wp:wrapNone/>
+                <wp:docPr id="17" name="文本框 2"/>
+                <wp:cNvGraphicFramePr/>
+                <a:graphic xmlns:a="http://schemas.openxmlformats.org/drawingml/2006/main">
+                  <a:graphicData uri="http://schemas.microsoft.com/office/word/2010/wordprocessingShape">
+                    <wps:wsp>
+                      <wps:cNvSpPr txBox="1">
+                        <a:spLocks noChangeArrowheads="1"/>
+                      </wps:cNvSpPr>
+                      <wps:spPr bwMode="auto">
+                        <a:xfrm>
+                          <a:off x="0" y="0"/>
+                          <a:ext cx="6979920" cy="1905635"/>
+                        </a:xfrm>
+                        <a:prstGeom prst="rect">
+                          <a:avLst/>
+                        </a:prstGeom>
+                        <a:noFill/>
+                        <a:ln w="9525">
+                          <a:noFill/>
+                          <a:miter lim="800000"/>
+                        </a:ln>
+                      </wps:spPr>
+                      <wps:txbx>
+                        <w:txbxContent>
+                          <w:p>
+                            <w:pPr>
+                              <w:numPr>
+                                <w:ilvl w:val="0"/>
+                                <w:numId w:val="0"/>
+                              </w:numPr>
+                              <w:adjustRightInd w:val="0"/>
+                              <w:snapToGrid w:val="0"/>
+                              <w:ind w:leftChars="0"/>
+                              <w:rPr>
+                                <w:rFonts w:hint="eastAsia" w:ascii="微软雅黑" w:hAnsi="微软雅黑" w:eastAsia="微软雅黑" w:cs="微软雅黑"/>
+                                <w:b w:val="0"/>
+                                <w:bCs w:val="0"/>
+                                <w:color w:val="555555"/>
+                                <w:kern w:val="0"/>
+                                <w:sz w:val="21"/>
+                                <w:szCs w:val="21"/>
+                                <w:lang w:val="en-US" w:eastAsia="zh-CN" w:bidi="ar"/>
+                              </w:rPr>
+                            </w:pPr>
+                            <w:r>
+                              <w:rPr>
+                                <w:rFonts w:hint="eastAsia" w:ascii="微软雅黑" w:hAnsi="微软雅黑" w:eastAsia="微软雅黑" w:cs="微软雅黑"/>
+                                <w:b/>
+                                <w:bCs/>
+                                <w:color w:val="555555"/>
+                                <w:kern w:val="0"/>
+                                <w:sz w:val="21"/>
+                                <w:szCs w:val="21"/>
+                                <w:lang w:val="en-US" w:eastAsia="zh-CN" w:bidi="ar"/>
+                              </w:rPr>
+                              <w:t>双端交付：</w:t>
+                            </w:r>
+                            <w:r>
+                              <w:rPr>
+                                <w:rFonts w:hint="eastAsia" w:ascii="微软雅黑" w:hAnsi="微软雅黑" w:eastAsia="微软雅黑" w:cs="微软雅黑"/>
+                                <w:b w:val="0"/>
+                                <w:bCs w:val="0"/>
+                                <w:color w:val="555555"/>
+                                <w:kern w:val="0"/>
+                                <w:sz w:val="21"/>
+                                <w:szCs w:val="21"/>
+                                <w:lang w:val="en-US" w:eastAsia="zh-CN" w:bidi="ar"/>
+                              </w:rPr>
+                              <w:t>参与商旅 C 端预订链路（小程序/H5 直触用户）与 B 端配置中台 双线开发，累计交付 20+ 项需求/特性，随 15 次 release 上线。</w:t>
+                            </w:r>
+                          </w:p>
+                          <w:p>
+                            <w:pPr>
+                              <w:numPr>
+                                <w:ilvl w:val="0"/>
+                                <w:numId w:val="0"/>
+                              </w:numPr>
+                              <w:adjustRightInd w:val="0"/>
+                              <w:snapToGrid w:val="0"/>
+                              <w:ind w:leftChars="0"/>
+                              <w:rPr>
+                                <w:rFonts w:hint="default" w:ascii="微软雅黑" w:hAnsi="微软雅黑" w:eastAsia="微软雅黑" w:cs="微软雅黑"/>
+                                <w:b w:val="0"/>
+                                <w:bCs w:val="0"/>
+                                <w:color w:val="555555"/>
+                                <w:kern w:val="0"/>
+                                <w:sz w:val="21"/>
+                                <w:szCs w:val="21"/>
+                                <w:lang w:val="en-US" w:eastAsia="zh-CN" w:bidi="ar"/>
+                              </w:rPr>
+                            </w:pPr>
+                            <w:r>
+                              <w:rPr>
+                                <w:rFonts w:hint="default" w:ascii="微软雅黑" w:hAnsi="微软雅黑" w:eastAsia="微软雅黑" w:cs="微软雅黑"/>
+                                <w:b/>
+                                <w:bCs/>
+                                <w:color w:val="555555"/>
+                                <w:kern w:val="0"/>
+                                <w:sz w:val="21"/>
+                                <w:szCs w:val="21"/>
+                                <w:lang w:val="en-US" w:eastAsia="zh-CN" w:bidi="ar"/>
+                              </w:rPr>
+                              <w:t>性能与体验优化</w:t>
+                            </w:r>
+                            <w:r>
+                              <w:rPr>
+                                <w:rFonts w:hint="default" w:ascii="微软雅黑" w:hAnsi="微软雅黑" w:eastAsia="微软雅黑" w:cs="微软雅黑"/>
+                                <w:b w:val="0"/>
+                                <w:bCs w:val="0"/>
+                                <w:color w:val="555555"/>
+                                <w:kern w:val="0"/>
+                                <w:sz w:val="21"/>
+                                <w:szCs w:val="21"/>
+                                <w:lang w:val="en-US" w:eastAsia="zh-CN" w:bidi="ar"/>
+                              </w:rPr>
+                              <w:t>：针对商旅 H5/小程序首屏与列表渲染做懒加载、资源拆分与关键接口并行请求优化，缩短核心预订页加载时间，提升弱网环境下的可操作性与转化体验。</w:t>
+                            </w:r>
+                          </w:p>
+                          <w:p>
+                            <w:pPr>
+                              <w:numPr>
+                                <w:ilvl w:val="0"/>
+                                <w:numId w:val="0"/>
+                              </w:numPr>
+                              <w:adjustRightInd w:val="0"/>
+                              <w:snapToGrid w:val="0"/>
+                              <w:ind w:leftChars="0"/>
+                              <w:rPr>
+                                <w:rFonts w:hint="default" w:ascii="微软雅黑" w:hAnsi="微软雅黑" w:eastAsia="微软雅黑" w:cs="微软雅黑"/>
+                                <w:b w:val="0"/>
+                                <w:bCs w:val="0"/>
+                                <w:color w:val="555555"/>
+                                <w:kern w:val="0"/>
+                                <w:sz w:val="21"/>
+                                <w:szCs w:val="21"/>
+                                <w:lang w:val="en-US" w:eastAsia="zh-CN" w:bidi="ar"/>
+                              </w:rPr>
+                            </w:pPr>
+                            <w:r>
+                              <w:rPr>
+                                <w:rFonts w:hint="default" w:ascii="微软雅黑" w:hAnsi="微软雅黑" w:eastAsia="微软雅黑" w:cs="微软雅黑"/>
+                                <w:b/>
+                                <w:bCs/>
+                                <w:color w:val="555555"/>
+                                <w:kern w:val="0"/>
+                                <w:sz w:val="21"/>
+                                <w:szCs w:val="21"/>
+                                <w:lang w:val="en-US" w:eastAsia="zh-CN" w:bidi="ar"/>
+                              </w:rPr>
+                              <w:t>组件与质量保障</w:t>
+                            </w:r>
+                            <w:r>
+                              <w:rPr>
+                                <w:rFonts w:hint="default" w:ascii="微软雅黑" w:hAnsi="微软雅黑" w:eastAsia="微软雅黑" w:cs="微软雅黑"/>
+                                <w:b w:val="0"/>
+                                <w:bCs w:val="0"/>
+                                <w:color w:val="555555"/>
+                                <w:kern w:val="0"/>
+                                <w:sz w:val="21"/>
+                                <w:szCs w:val="21"/>
+                                <w:lang w:val="en-US" w:eastAsia="zh-CN" w:bidi="ar"/>
+                              </w:rPr>
+                              <w:t>：沉淀表单、列表、配置编辑等通用业务组件，减少 C/B 端重复开发；缩短单需求从理解到落地的周期，提升并行需求下的交付效率。</w:t>
+                            </w:r>
+                          </w:p>
+                          <w:p>
+                            <w:pPr>
+                              <w:numPr>
+                                <w:ilvl w:val="0"/>
+                                <w:numId w:val="0"/>
+                              </w:numPr>
+                              <w:adjustRightInd w:val="0"/>
+                              <w:snapToGrid w:val="0"/>
+                              <w:ind w:leftChars="0"/>
+                              <w:rPr>
+                                <w:rFonts w:hint="eastAsia" w:ascii="微软雅黑" w:hAnsi="微软雅黑" w:eastAsia="微软雅黑" w:cs="微软雅黑"/>
+                                <w:b w:val="0"/>
+                                <w:bCs w:val="0"/>
+                                <w:color w:val="555555"/>
+                                <w:kern w:val="0"/>
+                                <w:sz w:val="21"/>
+                                <w:szCs w:val="21"/>
+                                <w:lang w:val="en-US" w:eastAsia="zh-CN" w:bidi="ar"/>
+                              </w:rPr>
+                            </w:pPr>
+                            <w:r>
+                              <w:rPr>
+                                <w:rFonts w:hint="eastAsia" w:ascii="微软雅黑" w:hAnsi="微软雅黑" w:eastAsia="微软雅黑" w:cs="微软雅黑"/>
+                                <w:b/>
+                                <w:bCs/>
+                                <w:color w:val="555555"/>
+                                <w:kern w:val="0"/>
+                                <w:sz w:val="21"/>
+                                <w:szCs w:val="21"/>
+                                <w:lang w:val="en-US" w:eastAsia="zh-CN" w:bidi="ar"/>
+                              </w:rPr>
+                              <w:t>AI 协同研发</w:t>
+                            </w:r>
+                            <w:r>
+                              <w:rPr>
+                                <w:rFonts w:hint="eastAsia" w:ascii="微软雅黑" w:hAnsi="微软雅黑" w:eastAsia="微软雅黑" w:cs="微软雅黑"/>
+                                <w:b w:val="0"/>
+                                <w:bCs w:val="0"/>
+                                <w:color w:val="555555"/>
+                                <w:kern w:val="0"/>
+                                <w:sz w:val="21"/>
+                                <w:szCs w:val="21"/>
+                                <w:lang w:val="en-US" w:eastAsia="zh-CN" w:bidi="ar"/>
+                              </w:rPr>
+                              <w:t>：使用 Cooper、工作流 Skill 及页面脚手架串联需求分析、方案输出、开发实现与质量检查；在 AI 提效基础上，个人承担代码规范、CR 与发版把关，确保交付质量可控。</w:t>
+                            </w:r>
+                          </w:p>
+                          <w:p>
+                            <w:pPr>
+                              <w:numPr>
+                                <w:ilvl w:val="0"/>
+                                <w:numId w:val="0"/>
+                              </w:numPr>
+                              <w:adjustRightInd w:val="0"/>
+                              <w:snapToGrid w:val="0"/>
+                              <w:ind w:leftChars="0"/>
+                              <w:rPr>
+                                <w:rFonts w:hint="eastAsia" w:ascii="微软雅黑" w:hAnsi="微软雅黑" w:eastAsia="微软雅黑" w:cs="微软雅黑"/>
+                                <w:b/>
+                                <w:bCs/>
+                                <w:color w:val="555555"/>
+                                <w:kern w:val="0"/>
+                                <w:sz w:val="21"/>
+                                <w:szCs w:val="21"/>
+                                <w:lang w:val="en-US" w:eastAsia="zh-CN" w:bidi="ar"/>
+                              </w:rPr>
+                            </w:pPr>
+                          </w:p>
+                        </w:txbxContent>
+                      </wps:txbx>
+                      <wps:bodyPr rot="0" vert="horz" wrap="square" lIns="91440" tIns="45720" rIns="91440" bIns="45720" anchor="t" anchorCtr="0">
+                        <a:noAutofit/>
+                      </wps:bodyPr>
+                    </wps:wsp>
+                  </a:graphicData>
+                </a:graphic>
+              </wp:anchor>
+            </w:drawing>
+          </mc:Choice>
+          <mc:Fallback>
+            <w:pict>
+              <v:shape id="文本框 2" o:spid="_x0000_s1026" o:spt="202" type="#_x0000_t202" style="position:absolute;left:0pt;margin-left:4.3pt;margin-top:35.1pt;height:150.05pt;width:549.6pt;z-index:251673600;mso-width-relative:page;mso-height-relative:page;" filled="f" stroked="f" coordsize="21600,21600" o:gfxdata="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">
+                <v:fill on="f" focussize="0,0"/>
+                <v:stroke on="f" miterlimit="8" joinstyle="miter"/>
+                <v:imagedata o:title=""/>
+                <o:lock v:ext="edit" aspectratio="f"/>
+                <v:textbox>
+                  <w:txbxContent>
+                    <w:p>
+                      <w:pPr>
+                        <w:numPr>
+                          <w:ilvl w:val="0"/>
+                          <w:numId w:val="0"/>
+                        </w:numPr>
+                        <w:adjustRightInd w:val="0"/>
+                        <w:snapToGrid w:val="0"/>
+                        <w:ind w:leftChars="0"/>
+                        <w:rPr>
+                          <w:rFonts w:hint="eastAsia" w:ascii="微软雅黑" w:hAnsi="微软雅黑" w:eastAsia="微软雅黑" w:cs="微软雅黑"/>
+                          <w:b w:val="0"/>
+                          <w:bCs w:val="0"/>
+                          <w:color w:val="555555"/>
+                          <w:kern w:val="0"/>
+                          <w:sz w:val="21"/>
+                          <w:szCs w:val="21"/>
+                          <w:lang w:val="en-US" w:eastAsia="zh-CN" w:bidi="ar"/>
+                        </w:rPr>
+                      </w:pPr>
+                      <w:r>
+                        <w:rPr>
+                          <w:rFonts w:hint="eastAsia" w:ascii="微软雅黑" w:hAnsi="微软雅黑" w:eastAsia="微软雅黑" w:cs="微软雅黑"/>
+                          <w:b/>
+                          <w:bCs/>
+                          <w:color w:val="555555"/>
+                          <w:kern w:val="0"/>
+                          <w:sz w:val="21"/>
+                          <w:szCs w:val="21"/>
+                          <w:lang w:val="en-US" w:eastAsia="zh-CN" w:bidi="ar"/>
+                        </w:rPr>
+                        <w:t>双端交付：</w:t>
+                      </w:r>
+                      <w:r>
+                        <w:rPr>
+                          <w:rFonts w:hint="eastAsia" w:ascii="微软雅黑" w:hAnsi="微软雅黑" w:eastAsia="微软雅黑" w:cs="微软雅黑"/>
+                          <w:b w:val="0"/>
+                          <w:bCs w:val="0"/>
+                          <w:color w:val="555555"/>
+                          <w:kern w:val="0"/>
+                          <w:sz w:val="21"/>
+                          <w:szCs w:val="21"/>
+                          <w:lang w:val="en-US" w:eastAsia="zh-CN" w:bidi="ar"/>
+                        </w:rPr>
+                        <w:t>参与商旅 C 端预订链路（小程序/H5 直触用户）与 B 端配置中台 双线开发，累计交付 20+ 项需求/特性，随 15 次 release 上线。</w:t>
+                      </w:r>
+                    </w:p>
+                    <w:p>
+                      <w:pPr>
+                        <w:numPr>
+                          <w:ilvl w:val="0"/>
+                          <w:numId w:val="0"/>
+                        </w:numPr>
+                        <w:adjustRightInd w:val="0"/>
+                        <w:snapToGrid w:val="0"/>
+                        <w:ind w:leftChars="0"/>
+                        <w:rPr>
+                          <w:rFonts w:hint="default" w:ascii="微软雅黑" w:hAnsi="微软雅黑" w:eastAsia="微软雅黑" w:cs="微软雅黑"/>
+                          <w:b w:val="0"/>
+                          <w:bCs w:val="0"/>
+                          <w:color w:val="555555"/>
+                          <w:kern w:val="0"/>
+                          <w:sz w:val="21"/>
+                          <w:szCs w:val="21"/>
+                          <w:lang w:val="en-US" w:eastAsia="zh-CN" w:bidi="ar"/>
+                        </w:rPr>
+                      </w:pPr>
+                      <w:r>
+                        <w:rPr>
+                          <w:rFonts w:hint="default" w:ascii="微软雅黑" w:hAnsi="微软雅黑" w:eastAsia="微软雅黑" w:cs="微软雅黑"/>
+                          <w:b/>
+                          <w:bCs/>
+                          <w:color w:val="555555"/>
+                          <w:kern w:val="0"/>
+                          <w:sz w:val="21"/>
+                          <w:szCs w:val="21"/>
+                          <w:lang w:val="en-US" w:eastAsia="zh-CN" w:bidi="ar"/>
+                        </w:rPr>
+                        <w:t>性能与体验优化</w:t>
+                      </w:r>
+                      <w:r>
+                        <w:rPr>
+                          <w:rFonts w:hint="default" w:ascii="微软雅黑" w:hAnsi="微软雅黑" w:eastAsia="微软雅黑" w:cs="微软雅黑"/>
+                          <w:b w:val="0"/>
+                          <w:bCs w:val="0"/>
+                          <w:color w:val="555555"/>
+                          <w:kern w:val="0"/>
+                          <w:sz w:val="21"/>
+                          <w:szCs w:val="21"/>
+                          <w:lang w:val="en-US" w:eastAsia="zh-CN" w:bidi="ar"/>
+                        </w:rPr>
+                        <w:t>：针对商旅 H5/小程序首屏与列表渲染做懒加载、资源拆分与关键接口并行请求优化，缩短核心预订页加载时间，提升弱网环境下的可操作性与转化体验。</w:t>
+                      </w:r>
+                    </w:p>
+                    <w:p>
+                      <w:pPr>
+                        <w:numPr>
+                          <w:ilvl w:val="0"/>
+                          <w:numId w:val="0"/>
+                        </w:numPr>
+                        <w:adjustRightInd w:val="0"/>
+                        <w:snapToGrid w:val="0"/>
+                        <w:ind w:leftChars="0"/>
+                        <w:rPr>
+                          <w:rFonts w:hint="default" w:ascii="微软雅黑" w:hAnsi="微软雅黑" w:eastAsia="微软雅黑" w:cs="微软雅黑"/>
+                          <w:b w:val="0"/>
+                          <w:bCs w:val="0"/>
+                          <w:color w:val="555555"/>
+                          <w:kern w:val="0"/>
+                          <w:sz w:val="21"/>
+                          <w:szCs w:val="21"/>
+                          <w:lang w:val="en-US" w:eastAsia="zh-CN" w:bidi="ar"/>
+                        </w:rPr>
+                      </w:pPr>
+                      <w:r>
+                        <w:rPr>
+                          <w:rFonts w:hint="default" w:ascii="微软雅黑" w:hAnsi="微软雅黑" w:eastAsia="微软雅黑" w:cs="微软雅黑"/>
+                          <w:b/>
+                          <w:bCs/>
+                          <w:color w:val="555555"/>
+                          <w:kern w:val="0"/>
+                          <w:sz w:val="21"/>
+                          <w:szCs w:val="21"/>
+                          <w:lang w:val="en-US" w:eastAsia="zh-CN" w:bidi="ar"/>
+                        </w:rPr>
+                        <w:t>组件与质量保障</w:t>
+                      </w:r>
+                      <w:r>
+                        <w:rPr>
+                          <w:rFonts w:hint="default" w:ascii="微软雅黑" w:hAnsi="微软雅黑" w:eastAsia="微软雅黑" w:cs="微软雅黑"/>
+                          <w:b w:val="0"/>
+                          <w:bCs w:val="0"/>
+                          <w:color w:val="555555"/>
+                          <w:kern w:val="0"/>
+                          <w:sz w:val="21"/>
+                          <w:szCs w:val="21"/>
+                          <w:lang w:val="en-US" w:eastAsia="zh-CN" w:bidi="ar"/>
+                        </w:rPr>
+                        <w:t>：沉淀表单、列表、配置编辑等通用业务组件，减少 C/B 端重复开发；缩短单需求从理解到落地的周期，提升并行需求下的交付效率。</w:t>
+                      </w:r>
+                    </w:p>
+                    <w:p>
+                      <w:pPr>
+                        <w:numPr>
+                          <w:ilvl w:val="0"/>
+                          <w:numId w:val="0"/>
+                        </w:numPr>
+                        <w:adjustRightInd w:val="0"/>
+                        <w:snapToGrid w:val="0"/>
+                        <w:ind w:leftChars="0"/>
+                        <w:rPr>
+                          <w:rFonts w:hint="eastAsia" w:ascii="微软雅黑" w:hAnsi="微软雅黑" w:eastAsia="微软雅黑" w:cs="微软雅黑"/>
+                          <w:b w:val="0"/>
+                          <w:bCs w:val="0"/>
+                          <w:color w:val="555555"/>
+                          <w:kern w:val="0"/>
+                          <w:sz w:val="21"/>
+                          <w:szCs w:val="21"/>
+                          <w:lang w:val="en-US" w:eastAsia="zh-CN" w:bidi="ar"/>
+                        </w:rPr>
+                      </w:pPr>
+                      <w:r>
+                        <w:rPr>
+                          <w:rFonts w:hint="eastAsia" w:ascii="微软雅黑" w:hAnsi="微软雅黑" w:eastAsia="微软雅黑" w:cs="微软雅黑"/>
+                          <w:b/>
+                          <w:bCs/>
+                          <w:color w:val="555555"/>
+                          <w:kern w:val="0"/>
+                          <w:sz w:val="21"/>
+                          <w:szCs w:val="21"/>
+                          <w:lang w:val="en-US" w:eastAsia="zh-CN" w:bidi="ar"/>
+                        </w:rPr>
+                        <w:t>AI 协同研发</w:t>
+                      </w:r>
+                      <w:r>
+                        <w:rPr>
+                          <w:rFonts w:hint="eastAsia" w:ascii="微软雅黑" w:hAnsi="微软雅黑" w:eastAsia="微软雅黑" w:cs="微软雅黑"/>
+                          <w:b w:val="0"/>
+                          <w:bCs w:val="0"/>
+                          <w:color w:val="555555"/>
+                          <w:kern w:val="0"/>
+                          <w:sz w:val="21"/>
+                          <w:szCs w:val="21"/>
+                          <w:lang w:val="en-US" w:eastAsia="zh-CN" w:bidi="ar"/>
+                        </w:rPr>
+                        <w:t>：使用 Cooper、工作流 Skill 及页面脚手架串联需求分析、方案输出、开发实现与质量检查；在 AI 提效基础上，个人承担代码规范、CR 与发版把关，确保交付质量可控。</w:t>
+                      </w:r>
+                    </w:p>
+                    <w:p>
+                      <w:pPr>
+                        <w:numPr>
+                          <w:ilvl w:val="0"/>
+                          <w:numId w:val="0"/>
+                        </w:numPr>
+                        <w:adjustRightInd w:val="0"/>
+                        <w:snapToGrid w:val="0"/>
+                        <w:ind w:leftChars="0"/>
+                        <w:rPr>
+                          <w:rFonts w:hint="eastAsia" w:ascii="微软雅黑" w:hAnsi="微软雅黑" w:eastAsia="微软雅黑" w:cs="微软雅黑"/>
+                          <w:b/>
+                          <w:bCs/>
+                          <w:color w:val="555555"/>
+                          <w:kern w:val="0"/>
+                          <w:sz w:val="21"/>
+                          <w:szCs w:val="21"/>
+                          <w:lang w:val="en-US" w:eastAsia="zh-CN" w:bidi="ar"/>
+                        </w:rPr>
+                      </w:pPr>
+                    </w:p>
+                  </w:txbxContent>
+                </v:textbox>
+              </v:shape>
+            </w:pict>
+          </mc:Fallback>
+        </mc:AlternateContent>
+      </w:r>
     </w:p>
     <w:p>
       <w:pPr>
@@ -4274,10 +4274,10 @@
               <wp:anchor distT="0" distB="0" distL="114300" distR="114300" simplePos="0" relativeHeight="251676672" behindDoc="0" locked="0" layoutInCell="1" allowOverlap="1">
                 <wp:simplePos x="0" y="0"/>
                 <wp:positionH relativeFrom="column">
-                  <wp:posOffset>-62230</wp:posOffset>
+                  <wp:posOffset>-40640</wp:posOffset>
                 </wp:positionH>
                 <wp:positionV relativeFrom="paragraph">
-                  <wp:posOffset>575310</wp:posOffset>
+                  <wp:posOffset>574675</wp:posOffset>
                 </wp:positionV>
                 <wp:extent cx="6885940" cy="404495"/>
                 <wp:effectExtent l="0" t="0" r="0" b="0"/>
@@ -4367,7 +4367,7 @@
           </mc:Choice>
           <mc:Fallback>
             <w:pict>
-              <v:shape id="_x0000_s1026" o:spid="_x0000_s1026" o:spt="202" type="#_x0000_t202" style="position:absolute;left:0pt;margin-left:-4.9pt;margin-top:45.3pt;height:31.85pt;width:542.2pt;z-index:251676672;mso-width-relative:page;mso-height-relative:page;" filled="f" stroked="f" coordsize="21600,21600" o:gfxdata="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">
+              <v:shape id="_x0000_s1026" o:spid="_x0000_s1026" o:spt="202" type="#_x0000_t202" style="position:absolute;left:0pt;margin-left:-3.2pt;margin-top:45.25pt;height:31.85pt;width:542.2pt;z-index:251676672;mso-width-relative:page;mso-height-relative:page;" filled="f" stroked="f" coordsize="21600,21600" o:gfxdata="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">
                 <v:fill on="f" focussize="0,0"/>
                 <v:stroke on="f" weight="0.5pt"/>
                 <v:imagedata o:title=""/>
@@ -4426,14 +4426,6 @@
           <w:lang w:val="en-US" w:eastAsia="zh-CN"/>
         </w:rPr>
       </w:pPr>
-    </w:p>
-    <w:p>
-      <w:pPr>
-        <w:bidi w:val="0"/>
-        <w:rPr>
-          <w:lang w:val="en-US" w:eastAsia="zh-CN"/>
-        </w:rPr>
-      </w:pPr>
       <w:r>
         <w:rPr>
           <w:sz w:val="21"/>
@@ -4444,12 +4436,12 @@
               <wp:anchor distT="0" distB="0" distL="114300" distR="114300" simplePos="0" relativeHeight="251674624" behindDoc="0" locked="0" layoutInCell="1" allowOverlap="1">
                 <wp:simplePos x="0" y="0"/>
                 <wp:positionH relativeFrom="column">
-                  <wp:posOffset>58420</wp:posOffset>
+                  <wp:posOffset>80010</wp:posOffset>
                 </wp:positionH>
                 <wp:positionV relativeFrom="paragraph">
-                  <wp:posOffset>12065</wp:posOffset>
+                  <wp:posOffset>168910</wp:posOffset>
                 </wp:positionV>
-                <wp:extent cx="7000240" cy="992505"/>
+                <wp:extent cx="6911340" cy="992505"/>
                 <wp:effectExtent l="0" t="0" r="0" b="0"/>
                 <wp:wrapNone/>
                 <wp:docPr id="28" name="文本框 2"/>
@@ -4463,7 +4455,7 @@
                       <wps:spPr bwMode="auto">
                         <a:xfrm>
                           <a:off x="0" y="0"/>
-                          <a:ext cx="7000240" cy="992505"/>
+                          <a:ext cx="6911340" cy="992505"/>
                         </a:xfrm>
                         <a:prstGeom prst="rect">
                           <a:avLst/>
@@ -4677,7 +4669,7 @@
           </mc:Choice>
           <mc:Fallback>
             <w:pict>
-              <v:shape id="文本框 2" o:spid="_x0000_s1026" o:spt="202" type="#_x0000_t202" style="position:absolute;left:0pt;margin-left:4.6pt;margin-top:0.95pt;height:78.15pt;width:551.2pt;z-index:251674624;mso-width-relative:page;mso-height-relative:page;" filled="f" stroked="f" coordsize="21600,21600" o:gfxdata="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">
+              <v:shape id="文本框 2" o:spid="_x0000_s1026" o:spt="202" type="#_x0000_t202" style="position:absolute;left:0pt;margin-left:6.3pt;margin-top:13.3pt;height:78.15pt;width:544.2pt;z-index:251674624;mso-width-relative:page;mso-height-relative:page;" filled="f" stroked="f" coordsize="21600,21600" o:gfxdata="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">
                 <v:fill on="f" focussize="0,0"/>
                 <v:stroke on="f" miterlimit="8" joinstyle="miter"/>
                 <v:imagedata o:title=""/>
@@ -4922,837 +4914,11 @@
     </w:p>
     <w:p>
       <w:pPr>
-        <w:tabs>
-          <w:tab w:val="left" w:pos="1521"/>
-        </w:tabs>
         <w:bidi w:val="0"/>
-        <w:jc w:val="left"/>
         <w:rPr>
           <w:lang w:val="en-US" w:eastAsia="zh-CN"/>
         </w:rPr>
       </w:pPr>
-      <w:r>
-        <w:rPr>
-          <w:sz w:val="21"/>
-        </w:rPr>
-        <mc:AlternateContent>
-          <mc:Choice Requires="wps">
-            <w:drawing>
-              <wp:anchor distT="0" distB="0" distL="114300" distR="114300" simplePos="0" relativeHeight="251671552" behindDoc="0" locked="0" layoutInCell="1" allowOverlap="1">
-                <wp:simplePos x="0" y="0"/>
-                <wp:positionH relativeFrom="column">
-                  <wp:posOffset>43815</wp:posOffset>
-                </wp:positionH>
-                <wp:positionV relativeFrom="paragraph">
-                  <wp:posOffset>690245</wp:posOffset>
-                </wp:positionV>
-                <wp:extent cx="7037705" cy="2132965"/>
-                <wp:effectExtent l="0" t="0" r="0" b="0"/>
-                <wp:wrapNone/>
-                <wp:docPr id="7" name="文本框 2"/>
-                <wp:cNvGraphicFramePr/>
-                <a:graphic xmlns:a="http://schemas.openxmlformats.org/drawingml/2006/main">
-                  <a:graphicData uri="http://schemas.microsoft.com/office/word/2010/wordprocessingShape">
-                    <wps:wsp>
-                      <wps:cNvSpPr txBox="1">
-                        <a:spLocks noChangeArrowheads="1"/>
-                      </wps:cNvSpPr>
-                      <wps:spPr bwMode="auto">
-                        <a:xfrm>
-                          <a:off x="0" y="0"/>
-                          <a:ext cx="7037705" cy="2132965"/>
-                        </a:xfrm>
-                        <a:prstGeom prst="rect">
-                          <a:avLst/>
-                        </a:prstGeom>
-                        <a:noFill/>
-                        <a:ln w="9525">
-                          <a:noFill/>
-                          <a:miter lim="800000"/>
-                        </a:ln>
-                      </wps:spPr>
-                      <wps:txbx>
-                        <w:txbxContent>
-                          <w:p>
-                            <w:pPr>
-                              <w:numPr>
-                                <w:ilvl w:val="0"/>
-                                <w:numId w:val="0"/>
-                              </w:numPr>
-                              <w:adjustRightInd w:val="0"/>
-                              <w:snapToGrid w:val="0"/>
-                              <w:ind w:leftChars="0"/>
-                              <w:rPr>
-                                <w:rFonts w:hint="eastAsia" w:ascii="微软雅黑" w:hAnsi="微软雅黑" w:eastAsia="微软雅黑" w:cs="微软雅黑"/>
-                                <w:b/>
-                                <w:bCs/>
-                                <w:color w:val="555555"/>
-                                <w:kern w:val="0"/>
-                                <w:sz w:val="21"/>
-                                <w:szCs w:val="21"/>
-                                <w:lang w:val="en-US" w:eastAsia="zh-CN" w:bidi="ar"/>
-                              </w:rPr>
-                            </w:pPr>
-                          </w:p>
-                          <w:p>
-                            <w:pPr>
-                              <w:numPr>
-                                <w:ilvl w:val="0"/>
-                                <w:numId w:val="0"/>
-                              </w:numPr>
-                              <w:adjustRightInd w:val="0"/>
-                              <w:snapToGrid w:val="0"/>
-                              <w:ind w:leftChars="0"/>
-                              <w:rPr>
-                                <w:rFonts w:hint="eastAsia" w:ascii="微软雅黑" w:hAnsi="微软雅黑" w:eastAsia="微软雅黑" w:cs="微软雅黑"/>
-                                <w:b w:val="0"/>
-                                <w:bCs w:val="0"/>
-                                <w:color w:val="555555"/>
-                                <w:kern w:val="0"/>
-                                <w:sz w:val="21"/>
-                                <w:szCs w:val="21"/>
-                                <w:lang w:val="en-US" w:eastAsia="zh-CN" w:bidi="ar"/>
-                              </w:rPr>
-                            </w:pPr>
-                            <w:r>
-                              <w:rPr>
-                                <w:rFonts w:hint="eastAsia" w:ascii="微软雅黑" w:hAnsi="微软雅黑" w:eastAsia="微软雅黑" w:cs="微软雅黑"/>
-                                <w:b/>
-                                <w:bCs/>
-                                <w:color w:val="555555"/>
-                                <w:kern w:val="0"/>
-                                <w:sz w:val="21"/>
-                                <w:szCs w:val="21"/>
-                                <w:lang w:val="en-US" w:eastAsia="zh-CN" w:bidi="ar"/>
-                              </w:rPr>
-                              <w:t>全链路产品：</w:t>
-                            </w:r>
-                            <w:r>
-                              <w:rPr>
-                                <w:rFonts w:hint="eastAsia" w:ascii="微软雅黑" w:hAnsi="微软雅黑" w:eastAsia="微软雅黑" w:cs="微软雅黑"/>
-                                <w:b w:val="0"/>
-                                <w:bCs w:val="0"/>
-                                <w:color w:val="555555"/>
-                                <w:kern w:val="0"/>
-                                <w:sz w:val="21"/>
-                                <w:szCs w:val="21"/>
-                                <w:lang w:val="en-US" w:eastAsia="zh-CN" w:bidi="ar"/>
-                              </w:rPr>
-                              <w:t>独立设计并实现「编辑 → 模板 → AI 优化 → 协作 → 投递追踪 → 导出」一站式平台，离线优先、登录后云同步</w:t>
-                            </w:r>
-                          </w:p>
-                          <w:p>
-                            <w:pPr>
-                              <w:numPr>
-                                <w:ilvl w:val="0"/>
-                                <w:numId w:val="0"/>
-                              </w:numPr>
-                              <w:adjustRightInd w:val="0"/>
-                              <w:snapToGrid w:val="0"/>
-                              <w:ind w:leftChars="0"/>
-                              <w:rPr>
-                                <w:rFonts w:hint="eastAsia" w:ascii="微软雅黑" w:hAnsi="微软雅黑" w:eastAsia="微软雅黑" w:cs="微软雅黑"/>
-                                <w:b w:val="0"/>
-                                <w:bCs w:val="0"/>
-                                <w:color w:val="555555"/>
-                                <w:kern w:val="0"/>
-                                <w:sz w:val="21"/>
-                                <w:szCs w:val="21"/>
-                                <w:lang w:val="en-US" w:eastAsia="zh-CN" w:bidi="ar"/>
-                              </w:rPr>
-                            </w:pPr>
-                            <w:r>
-                              <w:rPr>
-                                <w:rFonts w:hint="eastAsia" w:ascii="微软雅黑" w:hAnsi="微软雅黑" w:eastAsia="微软雅黑" w:cs="微软雅黑"/>
-                                <w:b/>
-                                <w:bCs/>
-                                <w:color w:val="555555"/>
-                                <w:kern w:val="0"/>
-                                <w:sz w:val="21"/>
-                                <w:szCs w:val="21"/>
-                                <w:lang w:val="en-US" w:eastAsia="zh-CN" w:bidi="ar"/>
-                              </w:rPr>
-                              <w:t>编辑与导出：</w:t>
-                            </w:r>
-                            <w:r>
-                              <w:rPr>
-                                <w:rFonts w:hint="eastAsia" w:ascii="微软雅黑" w:hAnsi="微软雅黑" w:eastAsia="微软雅黑" w:cs="微软雅黑"/>
-                                <w:b w:val="0"/>
-                                <w:bCs w:val="0"/>
-                                <w:color w:val="555555"/>
-                                <w:kern w:val="0"/>
-                                <w:sz w:val="21"/>
-                                <w:szCs w:val="21"/>
-                                <w:lang w:val="en-US" w:eastAsia="zh-CN" w:bidi="ar"/>
-                              </w:rPr>
-                              <w:t>TipTap 富文本 + Zod/RHF 多模块表单；模板 Manifest 与内容解耦；预览与 PDF 共用运行时保证所见即所得</w:t>
-                            </w:r>
-                          </w:p>
-                          <w:p>
-                            <w:pPr>
-                              <w:numPr>
-                                <w:ilvl w:val="0"/>
-                                <w:numId w:val="0"/>
-                              </w:numPr>
-                              <w:adjustRightInd w:val="0"/>
-                              <w:snapToGrid w:val="0"/>
-                              <w:ind w:leftChars="0"/>
-                              <w:rPr>
-                                <w:rFonts w:hint="eastAsia" w:ascii="微软雅黑" w:hAnsi="微软雅黑" w:eastAsia="微软雅黑" w:cs="微软雅黑"/>
-                                <w:b w:val="0"/>
-                                <w:bCs w:val="0"/>
-                                <w:color w:val="555555"/>
-                                <w:kern w:val="0"/>
-                                <w:sz w:val="21"/>
-                                <w:szCs w:val="21"/>
-                                <w:lang w:val="en-US" w:eastAsia="zh-CN" w:bidi="ar"/>
-                              </w:rPr>
-                            </w:pPr>
-                            <w:r>
-                              <w:rPr>
-                                <w:rFonts w:hint="eastAsia" w:ascii="微软雅黑" w:hAnsi="微软雅黑" w:eastAsia="微软雅黑" w:cs="微软雅黑"/>
-                                <w:b/>
-                                <w:bCs/>
-                                <w:color w:val="555555"/>
-                                <w:kern w:val="0"/>
-                                <w:sz w:val="21"/>
-                                <w:szCs w:val="21"/>
-                                <w:lang w:val="en-US" w:eastAsia="zh-CN" w:bidi="ar"/>
-                              </w:rPr>
-                              <w:t>AI 应用：</w:t>
-                            </w:r>
-                            <w:r>
-                              <w:rPr>
-                                <w:rFonts w:hint="eastAsia" w:ascii="微软雅黑" w:hAnsi="微软雅黑" w:eastAsia="微软雅黑" w:cs="微软雅黑"/>
-                                <w:b w:val="0"/>
-                                <w:bCs w:val="0"/>
-                                <w:color w:val="555555"/>
-                                <w:kern w:val="0"/>
-                                <w:sz w:val="21"/>
-                                <w:szCs w:val="21"/>
-                                <w:lang w:val="en-US" w:eastAsia="zh-CN" w:bidi="ar"/>
-                              </w:rPr>
-                              <w:t>经 Edge Function 代理 DeepSeek，落地 ATS 结构化诊断（扫描与写入分离）、划词多候选改写、JD 两阶段派生与血缘管理</w:t>
-                            </w:r>
-                          </w:p>
-                          <w:p>
-                            <w:pPr>
-                              <w:numPr>
-                                <w:ilvl w:val="0"/>
-                                <w:numId w:val="0"/>
-                              </w:numPr>
-                              <w:adjustRightInd w:val="0"/>
-                              <w:snapToGrid w:val="0"/>
-                              <w:ind w:leftChars="0"/>
-                              <w:rPr>
-                                <w:rFonts w:hint="eastAsia" w:ascii="微软雅黑" w:hAnsi="微软雅黑" w:eastAsia="微软雅黑" w:cs="微软雅黑"/>
-                                <w:b w:val="0"/>
-                                <w:bCs w:val="0"/>
-                                <w:color w:val="555555"/>
-                                <w:kern w:val="0"/>
-                                <w:sz w:val="21"/>
-                                <w:szCs w:val="21"/>
-                                <w:lang w:val="en-US" w:eastAsia="zh-CN" w:bidi="ar"/>
-                              </w:rPr>
-                            </w:pPr>
-                            <w:r>
-                              <w:rPr>
-                                <w:rFonts w:hint="eastAsia" w:ascii="微软雅黑" w:hAnsi="微软雅黑" w:eastAsia="微软雅黑" w:cs="微软雅黑"/>
-                                <w:b/>
-                                <w:bCs/>
-                                <w:color w:val="555555"/>
-                                <w:kern w:val="0"/>
-                                <w:sz w:val="21"/>
-                                <w:szCs w:val="21"/>
-                                <w:lang w:val="en-US" w:eastAsia="zh-CN" w:bidi="ar"/>
-                              </w:rPr>
-                              <w:t>实时协作：</w:t>
-                            </w:r>
-                            <w:r>
-                              <w:rPr>
-                                <w:rFonts w:hint="eastAsia" w:ascii="微软雅黑" w:hAnsi="微软雅黑" w:eastAsia="微软雅黑" w:cs="微软雅黑"/>
-                                <w:b w:val="0"/>
-                                <w:bCs w:val="0"/>
-                                <w:color w:val="555555"/>
-                                <w:kern w:val="0"/>
-                                <w:sz w:val="21"/>
-                                <w:szCs w:val="21"/>
-                                <w:lang w:val="en-US" w:eastAsia="zh-CN" w:bidi="ar"/>
-                              </w:rPr>
-                              <w:t>基于 Automerge CRDT + Supabase Realtime，支持分享链接、远程光标与离线合并</w:t>
-                            </w:r>
-                          </w:p>
-                        </w:txbxContent>
-                      </wps:txbx>
-                      <wps:bodyPr rot="0" vert="horz" wrap="square" lIns="91440" tIns="45720" rIns="91440" bIns="45720" anchor="t" anchorCtr="0">
-                        <a:noAutofit/>
-                      </wps:bodyPr>
-                    </wps:wsp>
-                  </a:graphicData>
-                </a:graphic>
-              </wp:anchor>
-            </w:drawing>
-          </mc:Choice>
-          <mc:Fallback>
-            <w:pict>
-              <v:shape id="文本框 2" o:spid="_x0000_s1026" o:spt="202" type="#_x0000_t202" style="position:absolute;left:0pt;margin-left:3.45pt;margin-top:54.35pt;height:167.95pt;width:554.15pt;z-index:251671552;mso-width-relative:page;mso-height-relative:page;" filled="f" stroked="f" coordsize="21600,21600" o:gfxdata="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">
-                <v:fill on="f" focussize="0,0"/>
-                <v:stroke on="f" miterlimit="8" joinstyle="miter"/>
-                <v:imagedata o:title=""/>
-                <o:lock v:ext="edit" aspectratio="f"/>
-                <v:textbox>
-                  <w:txbxContent>
-                    <w:p>
-                      <w:pPr>
-                        <w:numPr>
-                          <w:ilvl w:val="0"/>
-                          <w:numId w:val="0"/>
-                        </w:numPr>
-                        <w:adjustRightInd w:val="0"/>
-                        <w:snapToGrid w:val="0"/>
-                        <w:ind w:leftChars="0"/>
-                        <w:rPr>
-                          <w:rFonts w:hint="eastAsia" w:ascii="微软雅黑" w:hAnsi="微软雅黑" w:eastAsia="微软雅黑" w:cs="微软雅黑"/>
-                          <w:b/>
-                          <w:bCs/>
-                          <w:color w:val="555555"/>
-                          <w:kern w:val="0"/>
-                          <w:sz w:val="21"/>
-                          <w:szCs w:val="21"/>
-                          <w:lang w:val="en-US" w:eastAsia="zh-CN" w:bidi="ar"/>
-                        </w:rPr>
-                      </w:pPr>
-                    </w:p>
-                    <w:p>
-                      <w:pPr>
-                        <w:numPr>
-                          <w:ilvl w:val="0"/>
-                          <w:numId w:val="0"/>
-                        </w:numPr>
-                        <w:adjustRightInd w:val="0"/>
-                        <w:snapToGrid w:val="0"/>
-                        <w:ind w:leftChars="0"/>
-                        <w:rPr>
-                          <w:rFonts w:hint="eastAsia" w:ascii="微软雅黑" w:hAnsi="微软雅黑" w:eastAsia="微软雅黑" w:cs="微软雅黑"/>
-                          <w:b w:val="0"/>
-                          <w:bCs w:val="0"/>
-                          <w:color w:val="555555"/>
-                          <w:kern w:val="0"/>
-                          <w:sz w:val="21"/>
-                          <w:szCs w:val="21"/>
-                          <w:lang w:val="en-US" w:eastAsia="zh-CN" w:bidi="ar"/>
-                        </w:rPr>
-                      </w:pPr>
-                      <w:r>
-                        <w:rPr>
-                          <w:rFonts w:hint="eastAsia" w:ascii="微软雅黑" w:hAnsi="微软雅黑" w:eastAsia="微软雅黑" w:cs="微软雅黑"/>
-                          <w:b/>
-                          <w:bCs/>
-                          <w:color w:val="555555"/>
-                          <w:kern w:val="0"/>
-                          <w:sz w:val="21"/>
-                          <w:szCs w:val="21"/>
-                          <w:lang w:val="en-US" w:eastAsia="zh-CN" w:bidi="ar"/>
-                        </w:rPr>
-                        <w:t>全链路产品：</w:t>
-                      </w:r>
-                      <w:r>
-                        <w:rPr>
-                          <w:rFonts w:hint="eastAsia" w:ascii="微软雅黑" w:hAnsi="微软雅黑" w:eastAsia="微软雅黑" w:cs="微软雅黑"/>
-                          <w:b w:val="0"/>
-                          <w:bCs w:val="0"/>
-                          <w:color w:val="555555"/>
-                          <w:kern w:val="0"/>
-                          <w:sz w:val="21"/>
-                          <w:szCs w:val="21"/>
-                          <w:lang w:val="en-US" w:eastAsia="zh-CN" w:bidi="ar"/>
-                        </w:rPr>
-                        <w:t>独立设计并实现「编辑 → 模板 → AI 优化 → 协作 → 投递追踪 → 导出」一站式平台，离线优先、登录后云同步</w:t>
-                      </w:r>
-                    </w:p>
-                    <w:p>
-                      <w:pPr>
-                        <w:numPr>
-                          <w:ilvl w:val="0"/>
-                          <w:numId w:val="0"/>
-                        </w:numPr>
-                        <w:adjustRightInd w:val="0"/>
-                        <w:snapToGrid w:val="0"/>
-                        <w:ind w:leftChars="0"/>
-                        <w:rPr>
-                          <w:rFonts w:hint="eastAsia" w:ascii="微软雅黑" w:hAnsi="微软雅黑" w:eastAsia="微软雅黑" w:cs="微软雅黑"/>
-                          <w:b w:val="0"/>
-                          <w:bCs w:val="0"/>
-                          <w:color w:val="555555"/>
-                          <w:kern w:val="0"/>
-                          <w:sz w:val="21"/>
-                          <w:szCs w:val="21"/>
-                          <w:lang w:val="en-US" w:eastAsia="zh-CN" w:bidi="ar"/>
-                        </w:rPr>
-                      </w:pPr>
-                      <w:r>
-                        <w:rPr>
-                          <w:rFonts w:hint="eastAsia" w:ascii="微软雅黑" w:hAnsi="微软雅黑" w:eastAsia="微软雅黑" w:cs="微软雅黑"/>
-                          <w:b/>
-                          <w:bCs/>
-                          <w:color w:val="555555"/>
-                          <w:kern w:val="0"/>
-                          <w:sz w:val="21"/>
-                          <w:szCs w:val="21"/>
-                          <w:lang w:val="en-US" w:eastAsia="zh-CN" w:bidi="ar"/>
-                        </w:rPr>
-                        <w:t>编辑与导出：</w:t>
-                      </w:r>
-                      <w:r>
-                        <w:rPr>
-                          <w:rFonts w:hint="eastAsia" w:ascii="微软雅黑" w:hAnsi="微软雅黑" w:eastAsia="微软雅黑" w:cs="微软雅黑"/>
-                          <w:b w:val="0"/>
-                          <w:bCs w:val="0"/>
-                          <w:color w:val="555555"/>
-                          <w:kern w:val="0"/>
-                          <w:sz w:val="21"/>
-                          <w:szCs w:val="21"/>
-                          <w:lang w:val="en-US" w:eastAsia="zh-CN" w:bidi="ar"/>
-                        </w:rPr>
-                        <w:t>TipTap 富文本 + Zod/RHF 多模块表单；模板 Manifest 与内容解耦；预览与 PDF 共用运行时保证所见即所得</w:t>
-                      </w:r>
-                    </w:p>
-                    <w:p>
-                      <w:pPr>
-                        <w:numPr>
-                          <w:ilvl w:val="0"/>
-                          <w:numId w:val="0"/>
-                        </w:numPr>
-                        <w:adjustRightInd w:val="0"/>
-                        <w:snapToGrid w:val="0"/>
-                        <w:ind w:leftChars="0"/>
-                        <w:rPr>
-                          <w:rFonts w:hint="eastAsia" w:ascii="微软雅黑" w:hAnsi="微软雅黑" w:eastAsia="微软雅黑" w:cs="微软雅黑"/>
-                          <w:b w:val="0"/>
-                          <w:bCs w:val="0"/>
-                          <w:color w:val="555555"/>
-                          <w:kern w:val="0"/>
-                          <w:sz w:val="21"/>
-                          <w:szCs w:val="21"/>
-                          <w:lang w:val="en-US" w:eastAsia="zh-CN" w:bidi="ar"/>
-                        </w:rPr>
-                      </w:pPr>
-                      <w:r>
-                        <w:rPr>
-                          <w:rFonts w:hint="eastAsia" w:ascii="微软雅黑" w:hAnsi="微软雅黑" w:eastAsia="微软雅黑" w:cs="微软雅黑"/>
-                          <w:b/>
-                          <w:bCs/>
-                          <w:color w:val="555555"/>
-                          <w:kern w:val="0"/>
-                          <w:sz w:val="21"/>
-                          <w:szCs w:val="21"/>
-                          <w:lang w:val="en-US" w:eastAsia="zh-CN" w:bidi="ar"/>
-                        </w:rPr>
-                        <w:t>AI 应用：</w:t>
-                      </w:r>
-                      <w:r>
-                        <w:rPr>
-                          <w:rFonts w:hint="eastAsia" w:ascii="微软雅黑" w:hAnsi="微软雅黑" w:eastAsia="微软雅黑" w:cs="微软雅黑"/>
-                          <w:b w:val="0"/>
-                          <w:bCs w:val="0"/>
-                          <w:color w:val="555555"/>
-                          <w:kern w:val="0"/>
-                          <w:sz w:val="21"/>
-                          <w:szCs w:val="21"/>
-                          <w:lang w:val="en-US" w:eastAsia="zh-CN" w:bidi="ar"/>
-                        </w:rPr>
-                        <w:t>经 Edge Function 代理 DeepSeek，落地 ATS 结构化诊断（扫描与写入分离）、划词多候选改写、JD 两阶段派生与血缘管理</w:t>
-                      </w:r>
-                    </w:p>
-                    <w:p>
-                      <w:pPr>
-                        <w:numPr>
-                          <w:ilvl w:val="0"/>
-                          <w:numId w:val="0"/>
-                        </w:numPr>
-                        <w:adjustRightInd w:val="0"/>
-                        <w:snapToGrid w:val="0"/>
-                        <w:ind w:leftChars="0"/>
-                        <w:rPr>
-                          <w:rFonts w:hint="eastAsia" w:ascii="微软雅黑" w:hAnsi="微软雅黑" w:eastAsia="微软雅黑" w:cs="微软雅黑"/>
-                          <w:b w:val="0"/>
-                          <w:bCs w:val="0"/>
-                          <w:color w:val="555555"/>
-                          <w:kern w:val="0"/>
-                          <w:sz w:val="21"/>
-                          <w:szCs w:val="21"/>
-                          <w:lang w:val="en-US" w:eastAsia="zh-CN" w:bidi="ar"/>
-                        </w:rPr>
-                      </w:pPr>
-                      <w:r>
-                        <w:rPr>
-                          <w:rFonts w:hint="eastAsia" w:ascii="微软雅黑" w:hAnsi="微软雅黑" w:eastAsia="微软雅黑" w:cs="微软雅黑"/>
-                          <w:b/>
-                          <w:bCs/>
-                          <w:color w:val="555555"/>
-                          <w:kern w:val="0"/>
-                          <w:sz w:val="21"/>
-                          <w:szCs w:val="21"/>
-                          <w:lang w:val="en-US" w:eastAsia="zh-CN" w:bidi="ar"/>
-                        </w:rPr>
-                        <w:t>实时协作：</w:t>
-                      </w:r>
-                      <w:r>
-                        <w:rPr>
-                          <w:rFonts w:hint="eastAsia" w:ascii="微软雅黑" w:hAnsi="微软雅黑" w:eastAsia="微软雅黑" w:cs="微软雅黑"/>
-                          <w:b w:val="0"/>
-                          <w:bCs w:val="0"/>
-                          <w:color w:val="555555"/>
-                          <w:kern w:val="0"/>
-                          <w:sz w:val="21"/>
-                          <w:szCs w:val="21"/>
-                          <w:lang w:val="en-US" w:eastAsia="zh-CN" w:bidi="ar"/>
-                        </w:rPr>
-                        <w:t>基于 Automerge CRDT + Supabase Realtime，支持分享链接、远程光标与离线合并</w:t>
-                      </w:r>
-                    </w:p>
-                  </w:txbxContent>
-                </v:textbox>
-              </v:shape>
-            </w:pict>
-          </mc:Fallback>
-        </mc:AlternateContent>
-      </w:r>
-      <w:r>
-        <w:rPr>
-          <w:sz w:val="21"/>
-        </w:rPr>
-        <mc:AlternateContent>
-          <mc:Choice Requires="wps">
-            <w:drawing>
-              <wp:anchor distT="0" distB="0" distL="114300" distR="114300" simplePos="0" relativeHeight="251675648" behindDoc="0" locked="0" layoutInCell="1" allowOverlap="1">
-                <wp:simplePos x="0" y="0"/>
-                <wp:positionH relativeFrom="column">
-                  <wp:posOffset>-107315</wp:posOffset>
-                </wp:positionH>
-                <wp:positionV relativeFrom="page">
-                  <wp:posOffset>8232775</wp:posOffset>
-                </wp:positionV>
-                <wp:extent cx="7099935" cy="565785"/>
-                <wp:effectExtent l="0" t="0" r="0" b="0"/>
-                <wp:wrapSquare wrapText="bothSides"/>
-                <wp:docPr id="44" name="文本框 44"/>
-                <wp:cNvGraphicFramePr/>
-                <a:graphic xmlns:a="http://schemas.openxmlformats.org/drawingml/2006/main">
-                  <a:graphicData uri="http://schemas.microsoft.com/office/word/2010/wordprocessingShape">
-                    <wps:wsp>
-                      <wps:cNvSpPr txBox="1"/>
-                      <wps:spPr>
-                        <a:xfrm>
-                          <a:off x="0" y="0"/>
-                          <a:ext cx="7099935" cy="565785"/>
-                        </a:xfrm>
-                        <a:prstGeom prst="rect">
-                          <a:avLst/>
-                        </a:prstGeom>
-                        <a:noFill/>
-                        <a:ln w="6350">
-                          <a:noFill/>
-                        </a:ln>
-                      </wps:spPr>
-                      <wps:style>
-                        <a:lnRef idx="0">
-                          <a:schemeClr val="accent1"/>
-                        </a:lnRef>
-                        <a:fillRef idx="0">
-                          <a:schemeClr val="accent1"/>
-                        </a:fillRef>
-                        <a:effectRef idx="0">
-                          <a:schemeClr val="accent1"/>
-                        </a:effectRef>
-                        <a:fontRef idx="minor">
-                          <a:schemeClr val="dk1"/>
-                        </a:fontRef>
-                      </wps:style>
-                      <wps:txbx>
-                        <w:txbxContent>
-                          <w:p>
-                            <w:pPr>
-                              <w:numPr>
-                                <w:ilvl w:val="0"/>
-                                <w:numId w:val="0"/>
-                              </w:numPr>
-                              <w:adjustRightInd w:val="0"/>
-                              <w:snapToGrid w:val="0"/>
-                              <w:ind w:leftChars="0"/>
-                              <w:rPr>
-                                <w:rFonts w:hint="eastAsia" w:ascii="微软雅黑" w:hAnsi="微软雅黑" w:eastAsia="微软雅黑" w:cs="微软雅黑"/>
-                                <w:b/>
-                                <w:bCs/>
-                                <w:color w:val="0F27AE"/>
-                                <w:kern w:val="0"/>
-                                <w:sz w:val="21"/>
-                                <w:szCs w:val="21"/>
-                                <w:lang w:val="en-US" w:eastAsia="zh-CN" w:bidi="ar"/>
-                              </w:rPr>
-                            </w:pPr>
-                            <w:r>
-                              <w:rPr>
-                                <w:rFonts w:hint="eastAsia" w:ascii="微软雅黑" w:hAnsi="微软雅黑" w:eastAsia="微软雅黑" w:cs="微软雅黑"/>
-                                <w:b/>
-                                <w:bCs/>
-                                <w:color w:val="0F27AE"/>
-                                <w:kern w:val="0"/>
-                                <w:sz w:val="21"/>
-                                <w:szCs w:val="21"/>
-                                <w:lang w:val="en-US" w:eastAsia="zh-CN" w:bidi="ar"/>
-                              </w:rPr>
-                              <w:t>GResume · 智能简历创作与求职管理平台 | React19 / TipTap / CRDT / LLM | 个人项目 | 2025.10 — 2026.06</w:t>
-                            </w:r>
-                          </w:p>
-                          <w:p>
-                            <w:pPr>
-                              <w:numPr>
-                                <w:ilvl w:val="0"/>
-                                <w:numId w:val="0"/>
-                              </w:numPr>
-                              <w:adjustRightInd w:val="0"/>
-                              <w:snapToGrid w:val="0"/>
-                              <w:ind w:leftChars="0"/>
-                              <w:rPr>
-                                <w:rFonts w:hint="eastAsia" w:ascii="微软雅黑" w:hAnsi="微软雅黑" w:eastAsia="微软雅黑" w:cs="微软雅黑"/>
-                                <w:b/>
-                                <w:bCs/>
-                                <w:color w:val="auto"/>
-                                <w:kern w:val="0"/>
-                                <w:sz w:val="21"/>
-                                <w:szCs w:val="21"/>
-                                <w:lang w:val="en-US" w:eastAsia="zh-CN" w:bidi="ar"/>
-                              </w:rPr>
-                            </w:pPr>
-                            <w:r>
-                              <w:rPr>
-                                <w:rFonts w:hint="eastAsia" w:ascii="微软雅黑" w:hAnsi="微软雅黑" w:eastAsia="微软雅黑" w:cs="微软雅黑"/>
-                                <w:b/>
-                                <w:bCs/>
-                                <w:color w:val="auto"/>
-                                <w:kern w:val="0"/>
-                                <w:sz w:val="21"/>
-                                <w:szCs w:val="21"/>
-                                <w:lang w:val="en-US" w:eastAsia="zh-CN" w:bidi="ar"/>
-                              </w:rPr>
-                              <w:t>Github: https://github.com/506-FETL/resume</w:t>
-                            </w:r>
-                          </w:p>
-                          <w:p>
-                            <w:pPr>
-                              <w:numPr>
-                                <w:ilvl w:val="0"/>
-                                <w:numId w:val="0"/>
-                              </w:numPr>
-                              <w:adjustRightInd w:val="0"/>
-                              <w:snapToGrid w:val="0"/>
-                              <w:ind w:leftChars="0"/>
-                              <w:rPr>
-                                <w:rFonts w:hint="eastAsia" w:ascii="微软雅黑" w:hAnsi="微软雅黑" w:eastAsia="微软雅黑" w:cs="微软雅黑"/>
-                                <w:b w:val="0"/>
-                                <w:bCs w:val="0"/>
-                                <w:i w:val="0"/>
-                                <w:iCs w:val="0"/>
-                                <w:color w:val="0000FF"/>
-                                <w:kern w:val="0"/>
-                                <w:sz w:val="21"/>
-                                <w:szCs w:val="21"/>
-                                <w:lang w:val="en-US" w:eastAsia="zh-CN" w:bidi="ar"/>
-                              </w:rPr>
-                            </w:pPr>
-                          </w:p>
-                          <w:p>
-                            <w:pPr>
-                              <w:keepNext w:val="0"/>
-                              <w:keepLines w:val="0"/>
-                              <w:pageBreakBefore w:val="0"/>
-                              <w:widowControl/>
-                              <w:suppressLineNumbers w:val="0"/>
-                              <w:kinsoku/>
-                              <w:wordWrap/>
-                              <w:overflowPunct/>
-                              <w:topLinePunct w:val="0"/>
-                              <w:bidi w:val="0"/>
-                              <w:adjustRightInd/>
-                              <w:snapToGrid/>
-                              <w:spacing w:line="120" w:lineRule="auto"/>
-                              <w:jc w:val="left"/>
-                              <w:textAlignment w:val="auto"/>
-                              <w:rPr>
-                                <w:rFonts w:hint="eastAsia" w:ascii="微软雅黑" w:hAnsi="微软雅黑" w:eastAsia="微软雅黑" w:cs="微软雅黑"/>
-                                <w:b/>
-                                <w:bCs/>
-                                <w:color w:val="0000FF"/>
-                                <w:kern w:val="0"/>
-                                <w:sz w:val="21"/>
-                                <w:szCs w:val="21"/>
-                                <w:lang w:val="en-US" w:eastAsia="zh-CN" w:bidi="ar"/>
-                              </w:rPr>
-                            </w:pPr>
-                          </w:p>
-                          <w:p>
-                            <w:pPr>
-                              <w:rPr>
-                                <w:color w:val="0000FF"/>
-                              </w:rPr>
-                            </w:pPr>
-                          </w:p>
-                        </w:txbxContent>
-                      </wps:txbx>
-                      <wps:bodyPr rot="0" spcFirstLastPara="0" vertOverflow="overflow" horzOverflow="overflow" vert="horz" wrap="square" lIns="91440" tIns="45720" rIns="91440" bIns="45720" numCol="1" spcCol="0" rtlCol="0" fromWordArt="0" anchor="t" anchorCtr="0" forceAA="0" compatLnSpc="1">
-                        <a:noAutofit/>
-                      </wps:bodyPr>
-                    </wps:wsp>
-                  </a:graphicData>
-                </a:graphic>
-              </wp:anchor>
-            </w:drawing>
-          </mc:Choice>
-          <mc:Fallback>
-            <w:pict>
-              <v:shape id="_x0000_s1026" o:spid="_x0000_s1026" o:spt="202" type="#_x0000_t202" style="position:absolute;left:0pt;margin-left:-8.45pt;margin-top:648.25pt;height:44.55pt;width:559.05pt;mso-position-vertical-relative:page;mso-wrap-distance-bottom:0pt;mso-wrap-distance-left:9pt;mso-wrap-distance-right:9pt;mso-wrap-distance-top:0pt;z-index:251675648;mso-width-relative:page;mso-height-relative:page;" filled="f" stroked="f" coordsize="21600,21600" o:gfxdata="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">
-                <v:fill on="f" focussize="0,0"/>
-                <v:stroke on="f" weight="0.5pt"/>
-                <v:imagedata o:title=""/>
-                <o:lock v:ext="edit" aspectratio="f"/>
-                <v:textbox>
-                  <w:txbxContent>
-                    <w:p>
-                      <w:pPr>
-                        <w:numPr>
-                          <w:ilvl w:val="0"/>
-                          <w:numId w:val="0"/>
-                        </w:numPr>
-                        <w:adjustRightInd w:val="0"/>
-                        <w:snapToGrid w:val="0"/>
-                        <w:ind w:leftChars="0"/>
-                        <w:rPr>
-                          <w:rFonts w:hint="eastAsia" w:ascii="微软雅黑" w:hAnsi="微软雅黑" w:eastAsia="微软雅黑" w:cs="微软雅黑"/>
-                          <w:b/>
-                          <w:bCs/>
-                          <w:color w:val="0F27AE"/>
-                          <w:kern w:val="0"/>
-                          <w:sz w:val="21"/>
-                          <w:szCs w:val="21"/>
-                          <w:lang w:val="en-US" w:eastAsia="zh-CN" w:bidi="ar"/>
-                        </w:rPr>
-                      </w:pPr>
-                      <w:r>
-                        <w:rPr>
-                          <w:rFonts w:hint="eastAsia" w:ascii="微软雅黑" w:hAnsi="微软雅黑" w:eastAsia="微软雅黑" w:cs="微软雅黑"/>
-                          <w:b/>
-                          <w:bCs/>
-                          <w:color w:val="0F27AE"/>
-                          <w:kern w:val="0"/>
-                          <w:sz w:val="21"/>
-                          <w:szCs w:val="21"/>
-                          <w:lang w:val="en-US" w:eastAsia="zh-CN" w:bidi="ar"/>
-                        </w:rPr>
-                        <w:t>GResume · 智能简历创作与求职管理平台 | React19 / TipTap / CRDT / LLM | 个人项目 | 2025.10 — 2026.06</w:t>
-                      </w:r>
-                    </w:p>
-                    <w:p>
-                      <w:pPr>
-                        <w:numPr>
-                          <w:ilvl w:val="0"/>
-                          <w:numId w:val="0"/>
-                        </w:numPr>
-                        <w:adjustRightInd w:val="0"/>
-                        <w:snapToGrid w:val="0"/>
-                        <w:ind w:leftChars="0"/>
-                        <w:rPr>
-                          <w:rFonts w:hint="eastAsia" w:ascii="微软雅黑" w:hAnsi="微软雅黑" w:eastAsia="微软雅黑" w:cs="微软雅黑"/>
-                          <w:b/>
-                          <w:bCs/>
-                          <w:color w:val="auto"/>
-                          <w:kern w:val="0"/>
-                          <w:sz w:val="21"/>
-                          <w:szCs w:val="21"/>
-                          <w:lang w:val="en-US" w:eastAsia="zh-CN" w:bidi="ar"/>
-                        </w:rPr>
-                      </w:pPr>
-                      <w:r>
-                        <w:rPr>
-                          <w:rFonts w:hint="eastAsia" w:ascii="微软雅黑" w:hAnsi="微软雅黑" w:eastAsia="微软雅黑" w:cs="微软雅黑"/>
-                          <w:b/>
-                          <w:bCs/>
-                          <w:color w:val="auto"/>
-                          <w:kern w:val="0"/>
-                          <w:sz w:val="21"/>
-                          <w:szCs w:val="21"/>
-                          <w:lang w:val="en-US" w:eastAsia="zh-CN" w:bidi="ar"/>
-                        </w:rPr>
-                        <w:t>Github: https://github.com/506-FETL/resume</w:t>
-                      </w:r>
-                    </w:p>
-                    <w:p>
-                      <w:pPr>
-                        <w:numPr>
-                          <w:ilvl w:val="0"/>
-                          <w:numId w:val="0"/>
-                        </w:numPr>
-                        <w:adjustRightInd w:val="0"/>
-                        <w:snapToGrid w:val="0"/>
-                        <w:ind w:leftChars="0"/>
-                        <w:rPr>
-                          <w:rFonts w:hint="eastAsia" w:ascii="微软雅黑" w:hAnsi="微软雅黑" w:eastAsia="微软雅黑" w:cs="微软雅黑"/>
-                          <w:b w:val="0"/>
-                          <w:bCs w:val="0"/>
-                          <w:i w:val="0"/>
-                          <w:iCs w:val="0"/>
-                          <w:color w:val="0000FF"/>
-                          <w:kern w:val="0"/>
-                          <w:sz w:val="21"/>
-                          <w:szCs w:val="21"/>
-                          <w:lang w:val="en-US" w:eastAsia="zh-CN" w:bidi="ar"/>
-                        </w:rPr>
-                      </w:pPr>
-                    </w:p>
-                    <w:p>
-                      <w:pPr>
-                        <w:keepNext w:val="0"/>
-                        <w:keepLines w:val="0"/>
-                        <w:pageBreakBefore w:val="0"/>
-                        <w:widowControl/>
-                        <w:suppressLineNumbers w:val="0"/>
-                        <w:kinsoku/>
-                        <w:wordWrap/>
-                        <w:overflowPunct/>
-                        <w:topLinePunct w:val="0"/>
-                        <w:bidi w:val="0"/>
-                        <w:adjustRightInd/>
-                        <w:snapToGrid/>
-                        <w:spacing w:line="120" w:lineRule="auto"/>
-                        <w:jc w:val="left"/>
-                        <w:textAlignment w:val="auto"/>
-                        <w:rPr>
-                          <w:rFonts w:hint="eastAsia" w:ascii="微软雅黑" w:hAnsi="微软雅黑" w:eastAsia="微软雅黑" w:cs="微软雅黑"/>
-                          <w:b/>
-                          <w:bCs/>
-                          <w:color w:val="0000FF"/>
-                          <w:kern w:val="0"/>
-                          <w:sz w:val="21"/>
-                          <w:szCs w:val="21"/>
-                          <w:lang w:val="en-US" w:eastAsia="zh-CN" w:bidi="ar"/>
-                        </w:rPr>
-                      </w:pPr>
-                    </w:p>
-                    <w:p>
-                      <w:pPr>
-                        <w:rPr>
-                          <w:color w:val="0000FF"/>
-                        </w:rPr>
-                      </w:pPr>
-                    </w:p>
-                  </w:txbxContent>
-                </v:textbox>
-                <w10:wrap type="square"/>
-              </v:shape>
-            </w:pict>
-          </mc:Fallback>
-        </mc:AlternateContent>
-      </w:r>
       <w:r>
         <w:rPr>
           <w:sz w:val="21"/>
@@ -5766,7 +4932,7 @@
                   <wp:posOffset>-42545</wp:posOffset>
                 </wp:positionH>
                 <wp:positionV relativeFrom="paragraph">
-                  <wp:posOffset>123825</wp:posOffset>
+                  <wp:posOffset>38100</wp:posOffset>
                 </wp:positionV>
                 <wp:extent cx="7063740" cy="294640"/>
                 <wp:effectExtent l="0" t="0" r="3810" b="10160"/>
@@ -6225,7 +5391,7 @@
           </mc:Choice>
           <mc:Fallback>
             <w:pict>
-              <v:group id="_x0000_s1026" o:spid="_x0000_s1026" o:spt="203" style="position:absolute;left:0pt;margin-left:-3.35pt;margin-top:9.75pt;height:23.2pt;width:556.2pt;z-index:251668480;mso-width-relative:page;mso-height-relative:page;" coordorigin="-10798,0" coordsize="7065707,258119" o:gfxdata="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">
+              <v:group id="_x0000_s1026" o:spid="_x0000_s1026" o:spt="203" style="position:absolute;left:0pt;margin-left:-3.35pt;margin-top:3pt;height:23.2pt;width:556.2pt;z-index:251668480;mso-width-relative:page;mso-height-relative:page;" coordorigin="-10798,0" coordsize="7065707,258119" o:gfxdata="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">
                 <o:lock v:ext="edit" aspectratio="f"/>
                 <v:rect id="_x0000_s1026" o:spid="_x0000_s1026" o:spt="1" style="position:absolute;left:-10798;top:6119;height:252000;width:7065707;v-text-anchor:middle;" fillcolor="#F2F2F2 [3052]" filled="t" stroked="f" coordsize="21600,21600" o:gfxdata="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">
                   <v:fill on="t" focussize="0,0"/>
@@ -6602,6 +5768,900 @@
           </mc:Fallback>
         </mc:AlternateContent>
       </w:r>
+    </w:p>
+    <w:p>
+      <w:pPr>
+        <w:tabs>
+          <w:tab w:val="left" w:pos="1521"/>
+        </w:tabs>
+        <w:bidi w:val="0"/>
+        <w:jc w:val="left"/>
+        <w:rPr>
+          <w:lang w:val="en-US" w:eastAsia="zh-CN"/>
+        </w:rPr>
+      </w:pPr>
+      <w:r>
+        <w:rPr>
+          <w:sz w:val="21"/>
+        </w:rPr>
+        <mc:AlternateContent>
+          <mc:Choice Requires="wps">
+            <w:drawing>
+              <wp:anchor distT="0" distB="0" distL="114300" distR="114300" simplePos="0" relativeHeight="251675648" behindDoc="0" locked="0" layoutInCell="1" allowOverlap="1">
+                <wp:simplePos x="0" y="0"/>
+                <wp:positionH relativeFrom="column">
+                  <wp:posOffset>-107315</wp:posOffset>
+                </wp:positionH>
+                <wp:positionV relativeFrom="page">
+                  <wp:posOffset>8067675</wp:posOffset>
+                </wp:positionV>
+                <wp:extent cx="7099935" cy="565785"/>
+                <wp:effectExtent l="0" t="0" r="0" b="0"/>
+                <wp:wrapSquare wrapText="bothSides"/>
+                <wp:docPr id="44" name="文本框 44"/>
+                <wp:cNvGraphicFramePr/>
+                <a:graphic xmlns:a="http://schemas.openxmlformats.org/drawingml/2006/main">
+                  <a:graphicData uri="http://schemas.microsoft.com/office/word/2010/wordprocessingShape">
+                    <wps:wsp>
+                      <wps:cNvSpPr txBox="1"/>
+                      <wps:spPr>
+                        <a:xfrm>
+                          <a:off x="0" y="0"/>
+                          <a:ext cx="7099935" cy="565785"/>
+                        </a:xfrm>
+                        <a:prstGeom prst="rect">
+                          <a:avLst/>
+                        </a:prstGeom>
+                        <a:noFill/>
+                        <a:ln w="6350">
+                          <a:noFill/>
+                        </a:ln>
+                      </wps:spPr>
+                      <wps:style>
+                        <a:lnRef idx="0">
+                          <a:schemeClr val="accent1"/>
+                        </a:lnRef>
+                        <a:fillRef idx="0">
+                          <a:schemeClr val="accent1"/>
+                        </a:fillRef>
+                        <a:effectRef idx="0">
+                          <a:schemeClr val="accent1"/>
+                        </a:effectRef>
+                        <a:fontRef idx="minor">
+                          <a:schemeClr val="dk1"/>
+                        </a:fontRef>
+                      </wps:style>
+                      <wps:txbx>
+                        <w:txbxContent>
+                          <w:p>
+                            <w:pPr>
+                              <w:numPr>
+                                <w:ilvl w:val="0"/>
+                                <w:numId w:val="0"/>
+                              </w:numPr>
+                              <w:adjustRightInd w:val="0"/>
+                              <w:snapToGrid w:val="0"/>
+                              <w:ind w:leftChars="0"/>
+                              <w:rPr>
+                                <w:rFonts w:hint="eastAsia" w:ascii="微软雅黑" w:hAnsi="微软雅黑" w:eastAsia="微软雅黑" w:cs="微软雅黑"/>
+                                <w:b/>
+                                <w:bCs/>
+                                <w:color w:val="0F27AE"/>
+                                <w:kern w:val="0"/>
+                                <w:sz w:val="21"/>
+                                <w:szCs w:val="21"/>
+                                <w:lang w:val="en-US" w:eastAsia="zh-CN" w:bidi="ar"/>
+                              </w:rPr>
+                            </w:pPr>
+                            <w:r>
+                              <w:rPr>
+                                <w:rFonts w:hint="eastAsia" w:ascii="微软雅黑" w:hAnsi="微软雅黑" w:eastAsia="微软雅黑" w:cs="微软雅黑"/>
+                                <w:b/>
+                                <w:bCs/>
+                                <w:color w:val="0F27AE"/>
+                                <w:kern w:val="0"/>
+                                <w:sz w:val="21"/>
+                                <w:szCs w:val="21"/>
+                                <w:lang w:val="en-US" w:eastAsia="zh-CN" w:bidi="ar"/>
+                              </w:rPr>
+                              <w:t>GResume · 智能简历创作与求职管理平台 | React19 / TipTap / CRDT / LLM | 个人项目 | 2025.10 — 2026.06</w:t>
+                            </w:r>
+                          </w:p>
+                          <w:p>
+                            <w:pPr>
+                              <w:numPr>
+                                <w:ilvl w:val="0"/>
+                                <w:numId w:val="0"/>
+                              </w:numPr>
+                              <w:adjustRightInd w:val="0"/>
+                              <w:snapToGrid w:val="0"/>
+                              <w:ind w:leftChars="0"/>
+                              <w:rPr>
+                                <w:rFonts w:hint="eastAsia" w:ascii="微软雅黑" w:hAnsi="微软雅黑" w:eastAsia="微软雅黑" w:cs="微软雅黑"/>
+                                <w:b w:val="0"/>
+                                <w:bCs w:val="0"/>
+                                <w:i w:val="0"/>
+                                <w:iCs w:val="0"/>
+                                <w:color w:val="0000FF"/>
+                                <w:kern w:val="0"/>
+                                <w:sz w:val="21"/>
+                                <w:szCs w:val="21"/>
+                                <w:lang w:val="en-US" w:eastAsia="zh-CN" w:bidi="ar"/>
+                              </w:rPr>
+                            </w:pPr>
+                          </w:p>
+                          <w:p>
+                            <w:pPr>
+                              <w:keepNext w:val="0"/>
+                              <w:keepLines w:val="0"/>
+                              <w:pageBreakBefore w:val="0"/>
+                              <w:widowControl/>
+                              <w:suppressLineNumbers w:val="0"/>
+                              <w:kinsoku/>
+                              <w:wordWrap/>
+                              <w:overflowPunct/>
+                              <w:topLinePunct w:val="0"/>
+                              <w:bidi w:val="0"/>
+                              <w:adjustRightInd/>
+                              <w:snapToGrid/>
+                              <w:spacing w:line="120" w:lineRule="auto"/>
+                              <w:jc w:val="left"/>
+                              <w:textAlignment w:val="auto"/>
+                              <w:rPr>
+                                <w:rFonts w:hint="eastAsia" w:ascii="微软雅黑" w:hAnsi="微软雅黑" w:eastAsia="微软雅黑" w:cs="微软雅黑"/>
+                                <w:b/>
+                                <w:bCs/>
+                                <w:color w:val="0000FF"/>
+                                <w:kern w:val="0"/>
+                                <w:sz w:val="21"/>
+                                <w:szCs w:val="21"/>
+                                <w:lang w:val="en-US" w:eastAsia="zh-CN" w:bidi="ar"/>
+                              </w:rPr>
+                            </w:pPr>
+                          </w:p>
+                          <w:p>
+                            <w:pPr>
+                              <w:rPr>
+                                <w:color w:val="0000FF"/>
+                              </w:rPr>
+                            </w:pPr>
+                          </w:p>
+                        </w:txbxContent>
+                      </wps:txbx>
+                      <wps:bodyPr rot="0" spcFirstLastPara="0" vertOverflow="overflow" horzOverflow="overflow" vert="horz" wrap="square" lIns="91440" tIns="45720" rIns="91440" bIns="45720" numCol="1" spcCol="0" rtlCol="0" fromWordArt="0" anchor="t" anchorCtr="0" forceAA="0" compatLnSpc="1">
+                        <a:noAutofit/>
+                      </wps:bodyPr>
+                    </wps:wsp>
+                  </a:graphicData>
+                </a:graphic>
+              </wp:anchor>
+            </w:drawing>
+          </mc:Choice>
+          <mc:Fallback>
+            <w:pict>
+              <v:shape id="_x0000_s1026" o:spid="_x0000_s1026" o:spt="202" type="#_x0000_t202" style="position:absolute;left:0pt;margin-left:-8.45pt;margin-top:635.25pt;height:44.55pt;width:559.05pt;mso-position-vertical-relative:page;mso-wrap-distance-bottom:0pt;mso-wrap-distance-left:9pt;mso-wrap-distance-right:9pt;mso-wrap-distance-top:0pt;z-index:251675648;mso-width-relative:page;mso-height-relative:page;" filled="f" stroked="f" coordsize="21600,21600" o:gfxdata="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">
+                <v:fill on="f" focussize="0,0"/>
+                <v:stroke on="f" weight="0.5pt"/>
+                <v:imagedata o:title=""/>
+                <o:lock v:ext="edit" aspectratio="f"/>
+                <v:textbox>
+                  <w:txbxContent>
+                    <w:p>
+                      <w:pPr>
+                        <w:numPr>
+                          <w:ilvl w:val="0"/>
+                          <w:numId w:val="0"/>
+                        </w:numPr>
+                        <w:adjustRightInd w:val="0"/>
+                        <w:snapToGrid w:val="0"/>
+                        <w:ind w:leftChars="0"/>
+                        <w:rPr>
+                          <w:rFonts w:hint="eastAsia" w:ascii="微软雅黑" w:hAnsi="微软雅黑" w:eastAsia="微软雅黑" w:cs="微软雅黑"/>
+                          <w:b/>
+                          <w:bCs/>
+                          <w:color w:val="0F27AE"/>
+                          <w:kern w:val="0"/>
+                          <w:sz w:val="21"/>
+                          <w:szCs w:val="21"/>
+                          <w:lang w:val="en-US" w:eastAsia="zh-CN" w:bidi="ar"/>
+                        </w:rPr>
+                      </w:pPr>
+                      <w:r>
+                        <w:rPr>
+                          <w:rFonts w:hint="eastAsia" w:ascii="微软雅黑" w:hAnsi="微软雅黑" w:eastAsia="微软雅黑" w:cs="微软雅黑"/>
+                          <w:b/>
+                          <w:bCs/>
+                          <w:color w:val="0F27AE"/>
+                          <w:kern w:val="0"/>
+                          <w:sz w:val="21"/>
+                          <w:szCs w:val="21"/>
+                          <w:lang w:val="en-US" w:eastAsia="zh-CN" w:bidi="ar"/>
+                        </w:rPr>
+                        <w:t>GResume · 智能简历创作与求职管理平台 | React19 / TipTap / CRDT / LLM | 个人项目 | 2025.10 — 2026.06</w:t>
+                      </w:r>
+                    </w:p>
+                    <w:p>
+                      <w:pPr>
+                        <w:numPr>
+                          <w:ilvl w:val="0"/>
+                          <w:numId w:val="0"/>
+                        </w:numPr>
+                        <w:adjustRightInd w:val="0"/>
+                        <w:snapToGrid w:val="0"/>
+                        <w:ind w:leftChars="0"/>
+                        <w:rPr>
+                          <w:rFonts w:hint="eastAsia" w:ascii="微软雅黑" w:hAnsi="微软雅黑" w:eastAsia="微软雅黑" w:cs="微软雅黑"/>
+                          <w:b w:val="0"/>
+                          <w:bCs w:val="0"/>
+                          <w:i w:val="0"/>
+                          <w:iCs w:val="0"/>
+                          <w:color w:val="0000FF"/>
+                          <w:kern w:val="0"/>
+                          <w:sz w:val="21"/>
+                          <w:szCs w:val="21"/>
+                          <w:lang w:val="en-US" w:eastAsia="zh-CN" w:bidi="ar"/>
+                        </w:rPr>
+                      </w:pPr>
+                    </w:p>
+                    <w:p>
+                      <w:pPr>
+                        <w:keepNext w:val="0"/>
+                        <w:keepLines w:val="0"/>
+                        <w:pageBreakBefore w:val="0"/>
+                        <w:widowControl/>
+                        <w:suppressLineNumbers w:val="0"/>
+                        <w:kinsoku/>
+                        <w:wordWrap/>
+                        <w:overflowPunct/>
+                        <w:topLinePunct w:val="0"/>
+                        <w:bidi w:val="0"/>
+                        <w:adjustRightInd/>
+                        <w:snapToGrid/>
+                        <w:spacing w:line="120" w:lineRule="auto"/>
+                        <w:jc w:val="left"/>
+                        <w:textAlignment w:val="auto"/>
+                        <w:rPr>
+                          <w:rFonts w:hint="eastAsia" w:ascii="微软雅黑" w:hAnsi="微软雅黑" w:eastAsia="微软雅黑" w:cs="微软雅黑"/>
+                          <w:b/>
+                          <w:bCs/>
+                          <w:color w:val="0000FF"/>
+                          <w:kern w:val="0"/>
+                          <w:sz w:val="21"/>
+                          <w:szCs w:val="21"/>
+                          <w:lang w:val="en-US" w:eastAsia="zh-CN" w:bidi="ar"/>
+                        </w:rPr>
+                      </w:pPr>
+                    </w:p>
+                    <w:p>
+                      <w:pPr>
+                        <w:rPr>
+                          <w:color w:val="0000FF"/>
+                        </w:rPr>
+                      </w:pPr>
+                    </w:p>
+                  </w:txbxContent>
+                </v:textbox>
+                <w10:wrap type="square"/>
+              </v:shape>
+            </w:pict>
+          </mc:Fallback>
+        </mc:AlternateContent>
+      </w:r>
+      <w:r>
+        <w:rPr>
+          <w:sz w:val="21"/>
+        </w:rPr>
+        <mc:AlternateContent>
+          <mc:Choice Requires="wps">
+            <w:drawing>
+              <wp:anchor distT="0" distB="0" distL="114300" distR="114300" simplePos="0" relativeHeight="251671552" behindDoc="0" locked="0" layoutInCell="1" allowOverlap="1">
+                <wp:simplePos x="0" y="0"/>
+                <wp:positionH relativeFrom="column">
+                  <wp:posOffset>57785</wp:posOffset>
+                </wp:positionH>
+                <wp:positionV relativeFrom="paragraph">
+                  <wp:posOffset>274320</wp:posOffset>
+                </wp:positionV>
+                <wp:extent cx="6933565" cy="2132965"/>
+                <wp:effectExtent l="0" t="0" r="0" b="0"/>
+                <wp:wrapNone/>
+                <wp:docPr id="7" name="文本框 2"/>
+                <wp:cNvGraphicFramePr/>
+                <a:graphic xmlns:a="http://schemas.openxmlformats.org/drawingml/2006/main">
+                  <a:graphicData uri="http://schemas.microsoft.com/office/word/2010/wordprocessingShape">
+                    <wps:wsp>
+                      <wps:cNvSpPr txBox="1">
+                        <a:spLocks noChangeArrowheads="1"/>
+                      </wps:cNvSpPr>
+                      <wps:spPr bwMode="auto">
+                        <a:xfrm>
+                          <a:off x="0" y="0"/>
+                          <a:ext cx="6933565" cy="2132965"/>
+                        </a:xfrm>
+                        <a:prstGeom prst="rect">
+                          <a:avLst/>
+                        </a:prstGeom>
+                        <a:noFill/>
+                        <a:ln w="9525">
+                          <a:noFill/>
+                          <a:miter lim="800000"/>
+                        </a:ln>
+                      </wps:spPr>
+                      <wps:txbx>
+                        <w:txbxContent>
+                          <w:p>
+                            <w:pPr>
+                              <w:numPr>
+                                <w:ilvl w:val="0"/>
+                                <w:numId w:val="0"/>
+                              </w:numPr>
+                              <w:adjustRightInd w:val="0"/>
+                              <w:snapToGrid w:val="0"/>
+                              <w:ind w:leftChars="0"/>
+                              <w:rPr>
+                                <w:rFonts w:hint="eastAsia" w:ascii="微软雅黑" w:hAnsi="微软雅黑" w:eastAsia="微软雅黑" w:cs="微软雅黑"/>
+                                <w:b/>
+                                <w:bCs/>
+                                <w:color w:val="555555"/>
+                                <w:kern w:val="0"/>
+                                <w:sz w:val="21"/>
+                                <w:szCs w:val="21"/>
+                                <w:lang w:val="en-US" w:eastAsia="zh-CN" w:bidi="ar"/>
+                              </w:rPr>
+                            </w:pPr>
+                          </w:p>
+                          <w:p>
+                            <w:pPr>
+                              <w:numPr>
+                                <w:ilvl w:val="0"/>
+                                <w:numId w:val="0"/>
+                              </w:numPr>
+                              <w:adjustRightInd w:val="0"/>
+                              <w:snapToGrid w:val="0"/>
+                              <w:ind w:leftChars="0"/>
+                              <w:rPr>
+                                <w:rFonts w:hint="eastAsia" w:ascii="微软雅黑" w:hAnsi="微软雅黑" w:eastAsia="微软雅黑" w:cs="微软雅黑"/>
+                                <w:b w:val="0"/>
+                                <w:bCs w:val="0"/>
+                                <w:color w:val="555555"/>
+                                <w:kern w:val="0"/>
+                                <w:sz w:val="21"/>
+                                <w:szCs w:val="21"/>
+                                <w:lang w:val="en-US" w:eastAsia="zh-CN" w:bidi="ar"/>
+                              </w:rPr>
+                            </w:pPr>
+                            <w:r>
+                              <w:rPr>
+                                <w:rFonts w:hint="eastAsia" w:ascii="微软雅黑" w:hAnsi="微软雅黑" w:eastAsia="微软雅黑" w:cs="微软雅黑"/>
+                                <w:b/>
+                                <w:bCs/>
+                                <w:color w:val="555555"/>
+                                <w:kern w:val="0"/>
+                                <w:sz w:val="21"/>
+                                <w:szCs w:val="21"/>
+                                <w:lang w:val="en-US" w:eastAsia="zh-CN" w:bidi="ar"/>
+                              </w:rPr>
+                              <w:t>全链路产品：</w:t>
+                            </w:r>
+                            <w:r>
+                              <w:rPr>
+                                <w:rFonts w:hint="eastAsia" w:ascii="微软雅黑" w:hAnsi="微软雅黑" w:eastAsia="微软雅黑" w:cs="微软雅黑"/>
+                                <w:b w:val="0"/>
+                                <w:bCs w:val="0"/>
+                                <w:color w:val="555555"/>
+                                <w:kern w:val="0"/>
+                                <w:sz w:val="21"/>
+                                <w:szCs w:val="21"/>
+                                <w:lang w:val="en-US" w:eastAsia="zh-CN" w:bidi="ar"/>
+                              </w:rPr>
+                              <w:t>独立设计并实现「编辑 → 模板 → AI 优化 → 协作 → 投递追踪 → 导出」一站式平台，离线优先、登录后云同步</w:t>
+                            </w:r>
+                          </w:p>
+                          <w:p>
+                            <w:pPr>
+                              <w:numPr>
+                                <w:ilvl w:val="0"/>
+                                <w:numId w:val="0"/>
+                              </w:numPr>
+                              <w:adjustRightInd w:val="0"/>
+                              <w:snapToGrid w:val="0"/>
+                              <w:ind w:leftChars="0"/>
+                              <w:rPr>
+                                <w:rFonts w:hint="eastAsia" w:ascii="微软雅黑" w:hAnsi="微软雅黑" w:eastAsia="微软雅黑" w:cs="微软雅黑"/>
+                                <w:b w:val="0"/>
+                                <w:bCs w:val="0"/>
+                                <w:color w:val="555555"/>
+                                <w:kern w:val="0"/>
+                                <w:sz w:val="21"/>
+                                <w:szCs w:val="21"/>
+                                <w:lang w:val="en-US" w:eastAsia="zh-CN" w:bidi="ar"/>
+                              </w:rPr>
+                            </w:pPr>
+                            <w:r>
+                              <w:rPr>
+                                <w:rFonts w:hint="eastAsia" w:ascii="微软雅黑" w:hAnsi="微软雅黑" w:eastAsia="微软雅黑" w:cs="微软雅黑"/>
+                                <w:b/>
+                                <w:bCs/>
+                                <w:color w:val="555555"/>
+                                <w:kern w:val="0"/>
+                                <w:sz w:val="21"/>
+                                <w:szCs w:val="21"/>
+                                <w:lang w:val="en-US" w:eastAsia="zh-CN" w:bidi="ar"/>
+                              </w:rPr>
+                              <w:t>编辑与导出：</w:t>
+                            </w:r>
+                            <w:r>
+                              <w:rPr>
+                                <w:rFonts w:hint="eastAsia" w:ascii="微软雅黑" w:hAnsi="微软雅黑" w:eastAsia="微软雅黑" w:cs="微软雅黑"/>
+                                <w:b w:val="0"/>
+                                <w:bCs w:val="0"/>
+                                <w:color w:val="555555"/>
+                                <w:kern w:val="0"/>
+                                <w:sz w:val="21"/>
+                                <w:szCs w:val="21"/>
+                                <w:lang w:val="en-US" w:eastAsia="zh-CN" w:bidi="ar"/>
+                              </w:rPr>
+                              <w:t>TipTap 富文本 + Zod/RHF 多模块表单；模板 Manifest 与内容解耦；预览与 PDF 共用运行时保证所见即所得</w:t>
+                            </w:r>
+                          </w:p>
+                          <w:p>
+                            <w:pPr>
+                              <w:numPr>
+                                <w:ilvl w:val="0"/>
+                                <w:numId w:val="0"/>
+                              </w:numPr>
+                              <w:adjustRightInd w:val="0"/>
+                              <w:snapToGrid w:val="0"/>
+                              <w:ind w:leftChars="0"/>
+                              <w:rPr>
+                                <w:rFonts w:hint="eastAsia" w:ascii="微软雅黑" w:hAnsi="微软雅黑" w:eastAsia="微软雅黑" w:cs="微软雅黑"/>
+                                <w:b w:val="0"/>
+                                <w:bCs w:val="0"/>
+                                <w:color w:val="555555"/>
+                                <w:kern w:val="0"/>
+                                <w:sz w:val="21"/>
+                                <w:szCs w:val="21"/>
+                                <w:lang w:val="en-US" w:eastAsia="zh-CN" w:bidi="ar"/>
+                              </w:rPr>
+                            </w:pPr>
+                            <w:r>
+                              <w:rPr>
+                                <w:rFonts w:hint="eastAsia" w:ascii="微软雅黑" w:hAnsi="微软雅黑" w:eastAsia="微软雅黑" w:cs="微软雅黑"/>
+                                <w:b/>
+                                <w:bCs/>
+                                <w:color w:val="555555"/>
+                                <w:kern w:val="0"/>
+                                <w:sz w:val="21"/>
+                                <w:szCs w:val="21"/>
+                                <w:lang w:val="en-US" w:eastAsia="zh-CN" w:bidi="ar"/>
+                              </w:rPr>
+                              <w:t>AI 应用：</w:t>
+                            </w:r>
+                            <w:r>
+                              <w:rPr>
+                                <w:rFonts w:hint="eastAsia" w:ascii="微软雅黑" w:hAnsi="微软雅黑" w:eastAsia="微软雅黑" w:cs="微软雅黑"/>
+                                <w:b w:val="0"/>
+                                <w:bCs w:val="0"/>
+                                <w:color w:val="555555"/>
+                                <w:kern w:val="0"/>
+                                <w:sz w:val="21"/>
+                                <w:szCs w:val="21"/>
+                                <w:lang w:val="en-US" w:eastAsia="zh-CN" w:bidi="ar"/>
+                              </w:rPr>
+                              <w:t>经 Edge Function 代理 DeepSeek，落地 ATS 结构化诊断（扫描与写入分离）、划词多候选改写、JD 两阶段派生与血缘管理</w:t>
+                            </w:r>
+                          </w:p>
+                          <w:p>
+                            <w:pPr>
+                              <w:numPr>
+                                <w:ilvl w:val="0"/>
+                                <w:numId w:val="0"/>
+                              </w:numPr>
+                              <w:adjustRightInd w:val="0"/>
+                              <w:snapToGrid w:val="0"/>
+                              <w:ind w:leftChars="0"/>
+                              <w:rPr>
+                                <w:rFonts w:hint="eastAsia" w:ascii="微软雅黑" w:hAnsi="微软雅黑" w:eastAsia="微软雅黑" w:cs="微软雅黑"/>
+                                <w:b w:val="0"/>
+                                <w:bCs w:val="0"/>
+                                <w:color w:val="555555"/>
+                                <w:kern w:val="0"/>
+                                <w:sz w:val="21"/>
+                                <w:szCs w:val="21"/>
+                                <w:lang w:val="en-US" w:eastAsia="zh-CN" w:bidi="ar"/>
+                              </w:rPr>
+                            </w:pPr>
+                            <w:r>
+                              <w:rPr>
+                                <w:rFonts w:hint="eastAsia" w:ascii="微软雅黑" w:hAnsi="微软雅黑" w:eastAsia="微软雅黑" w:cs="微软雅黑"/>
+                                <w:b/>
+                                <w:bCs/>
+                                <w:color w:val="555555"/>
+                                <w:kern w:val="0"/>
+                                <w:sz w:val="21"/>
+                                <w:szCs w:val="21"/>
+                                <w:lang w:val="en-US" w:eastAsia="zh-CN" w:bidi="ar"/>
+                              </w:rPr>
+                              <w:t>实时协作：</w:t>
+                            </w:r>
+                            <w:r>
+                              <w:rPr>
+                                <w:rFonts w:hint="eastAsia" w:ascii="微软雅黑" w:hAnsi="微软雅黑" w:eastAsia="微软雅黑" w:cs="微软雅黑"/>
+                                <w:b w:val="0"/>
+                                <w:bCs w:val="0"/>
+                                <w:color w:val="555555"/>
+                                <w:kern w:val="0"/>
+                                <w:sz w:val="21"/>
+                                <w:szCs w:val="21"/>
+                                <w:lang w:val="en-US" w:eastAsia="zh-CN" w:bidi="ar"/>
+                              </w:rPr>
+                              <w:t>基于 Automerge CRDT + Supabase Realtime，支持分享链接、远程光标与离线合并</w:t>
+                            </w:r>
+                          </w:p>
+                          <w:p>
+                            <w:pPr>
+                              <w:numPr>
+                                <w:ilvl w:val="0"/>
+                                <w:numId w:val="0"/>
+                              </w:numPr>
+                              <w:adjustRightInd w:val="0"/>
+                              <w:snapToGrid w:val="0"/>
+                              <w:ind w:leftChars="0"/>
+                              <w:rPr>
+                                <w:rFonts w:hint="eastAsia" w:ascii="微软雅黑" w:hAnsi="微软雅黑" w:eastAsia="微软雅黑" w:cs="微软雅黑"/>
+                                <w:b w:val="0"/>
+                                <w:bCs w:val="0"/>
+                                <w:i/>
+                                <w:iCs/>
+                                <w:color w:val="555555"/>
+                                <w:kern w:val="0"/>
+                                <w:sz w:val="21"/>
+                                <w:szCs w:val="21"/>
+                                <w:lang w:val="en-US" w:eastAsia="zh-CN" w:bidi="ar"/>
+                              </w:rPr>
+                            </w:pPr>
+                            <w:r>
+                              <w:rPr>
+                                <w:rFonts w:hint="eastAsia" w:ascii="微软雅黑" w:hAnsi="微软雅黑" w:eastAsia="微软雅黑" w:cs="微软雅黑"/>
+                                <w:b/>
+                                <w:bCs/>
+                                <w:color w:val="555555"/>
+                                <w:kern w:val="0"/>
+                                <w:sz w:val="21"/>
+                                <w:szCs w:val="21"/>
+                                <w:lang w:val="en-US" w:eastAsia="zh-CN" w:bidi="ar"/>
+                              </w:rPr>
+                              <w:t>Github</w:t>
+                            </w:r>
+                            <w:r>
+                              <w:rPr>
+                                <w:rFonts w:hint="eastAsia" w:ascii="微软雅黑" w:hAnsi="微软雅黑" w:eastAsia="微软雅黑" w:cs="微软雅黑"/>
+                                <w:b w:val="0"/>
+                                <w:bCs w:val="0"/>
+                                <w:color w:val="555555"/>
+                                <w:kern w:val="0"/>
+                                <w:sz w:val="21"/>
+                                <w:szCs w:val="21"/>
+                                <w:lang w:val="en-US" w:eastAsia="zh-CN" w:bidi="ar"/>
+                              </w:rPr>
+                              <w:t>:</w:t>
+                            </w:r>
+                            <w:r>
+                              <w:rPr>
+                                <w:rFonts w:hint="eastAsia" w:ascii="微软雅黑" w:hAnsi="微软雅黑" w:eastAsia="微软雅黑" w:cs="微软雅黑"/>
+                                <w:b w:val="0"/>
+                                <w:bCs w:val="0"/>
+                                <w:i/>
+                                <w:iCs/>
+                                <w:color w:val="555555"/>
+                                <w:kern w:val="0"/>
+                                <w:sz w:val="21"/>
+                                <w:szCs w:val="21"/>
+                                <w:lang w:val="en-US" w:eastAsia="zh-CN" w:bidi="ar"/>
+                              </w:rPr>
+                              <w:t xml:space="preserve"> https://github.com/506-FETL/resume</w:t>
+                            </w:r>
+                          </w:p>
+                        </w:txbxContent>
+                      </wps:txbx>
+                      <wps:bodyPr rot="0" vert="horz" wrap="square" lIns="91440" tIns="45720" rIns="91440" bIns="45720" anchor="t" anchorCtr="0">
+                        <a:noAutofit/>
+                      </wps:bodyPr>
+                    </wps:wsp>
+                  </a:graphicData>
+                </a:graphic>
+              </wp:anchor>
+            </w:drawing>
+          </mc:Choice>
+          <mc:Fallback>
+            <w:pict>
+              <v:shape id="文本框 2" o:spid="_x0000_s1026" o:spt="202" type="#_x0000_t202" style="position:absolute;left:0pt;margin-left:4.55pt;margin-top:21.6pt;height:167.95pt;width:545.95pt;z-index:251671552;mso-width-relative:page;mso-height-relative:page;" filled="f" stroked="f" coordsize="21600,21600" o:gfxdata="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">
+                <v:fill on="f" focussize="0,0"/>
+                <v:stroke on="f" miterlimit="8" joinstyle="miter"/>
+                <v:imagedata o:title=""/>
+                <o:lock v:ext="edit" aspectratio="f"/>
+                <v:textbox>
+                  <w:txbxContent>
+                    <w:p>
+                      <w:pPr>
+                        <w:numPr>
+                          <w:ilvl w:val="0"/>
+                          <w:numId w:val="0"/>
+                        </w:numPr>
+                        <w:adjustRightInd w:val="0"/>
+                        <w:snapToGrid w:val="0"/>
+                        <w:ind w:leftChars="0"/>
+                        <w:rPr>
+                          <w:rFonts w:hint="eastAsia" w:ascii="微软雅黑" w:hAnsi="微软雅黑" w:eastAsia="微软雅黑" w:cs="微软雅黑"/>
+                          <w:b/>
+                          <w:bCs/>
+                          <w:color w:val="555555"/>
+                          <w:kern w:val="0"/>
+                          <w:sz w:val="21"/>
+                          <w:szCs w:val="21"/>
+                          <w:lang w:val="en-US" w:eastAsia="zh-CN" w:bidi="ar"/>
+                        </w:rPr>
+                      </w:pPr>
+                    </w:p>
+                    <w:p>
+                      <w:pPr>
+                        <w:numPr>
+                          <w:ilvl w:val="0"/>
+                          <w:numId w:val="0"/>
+                        </w:numPr>
+                        <w:adjustRightInd w:val="0"/>
+                        <w:snapToGrid w:val="0"/>
+                        <w:ind w:leftChars="0"/>
+                        <w:rPr>
+                          <w:rFonts w:hint="eastAsia" w:ascii="微软雅黑" w:hAnsi="微软雅黑" w:eastAsia="微软雅黑" w:cs="微软雅黑"/>
+                          <w:b w:val="0"/>
+                          <w:bCs w:val="0"/>
+                          <w:color w:val="555555"/>
+                          <w:kern w:val="0"/>
+                          <w:sz w:val="21"/>
+                          <w:szCs w:val="21"/>
+                          <w:lang w:val="en-US" w:eastAsia="zh-CN" w:bidi="ar"/>
+                        </w:rPr>
+                      </w:pPr>
+                      <w:r>
+                        <w:rPr>
+                          <w:rFonts w:hint="eastAsia" w:ascii="微软雅黑" w:hAnsi="微软雅黑" w:eastAsia="微软雅黑" w:cs="微软雅黑"/>
+                          <w:b/>
+                          <w:bCs/>
+                          <w:color w:val="555555"/>
+                          <w:kern w:val="0"/>
+                          <w:sz w:val="21"/>
+                          <w:szCs w:val="21"/>
+                          <w:lang w:val="en-US" w:eastAsia="zh-CN" w:bidi="ar"/>
+                        </w:rPr>
+                        <w:t>全链路产品：</w:t>
+                      </w:r>
+                      <w:r>
+                        <w:rPr>
+                          <w:rFonts w:hint="eastAsia" w:ascii="微软雅黑" w:hAnsi="微软雅黑" w:eastAsia="微软雅黑" w:cs="微软雅黑"/>
+                          <w:b w:val="0"/>
+                          <w:bCs w:val="0"/>
+                          <w:color w:val="555555"/>
+                          <w:kern w:val="0"/>
+                          <w:sz w:val="21"/>
+                          <w:szCs w:val="21"/>
+                          <w:lang w:val="en-US" w:eastAsia="zh-CN" w:bidi="ar"/>
+                        </w:rPr>
+                        <w:t>独立设计并实现「编辑 → 模板 → AI 优化 → 协作 → 投递追踪 → 导出」一站式平台，离线优先、登录后云同步</w:t>
+                      </w:r>
+                    </w:p>
+                    <w:p>
+                      <w:pPr>
+                        <w:numPr>
+                          <w:ilvl w:val="0"/>
+                          <w:numId w:val="0"/>
+                        </w:numPr>
+                        <w:adjustRightInd w:val="0"/>
+                        <w:snapToGrid w:val="0"/>
+                        <w:ind w:leftChars="0"/>
+                        <w:rPr>
+                          <w:rFonts w:hint="eastAsia" w:ascii="微软雅黑" w:hAnsi="微软雅黑" w:eastAsia="微软雅黑" w:cs="微软雅黑"/>
+                          <w:b w:val="0"/>
+                          <w:bCs w:val="0"/>
+                          <w:color w:val="555555"/>
+                          <w:kern w:val="0"/>
+                          <w:sz w:val="21"/>
+                          <w:szCs w:val="21"/>
+                          <w:lang w:val="en-US" w:eastAsia="zh-CN" w:bidi="ar"/>
+                        </w:rPr>
+                      </w:pPr>
+                      <w:r>
+                        <w:rPr>
+                          <w:rFonts w:hint="eastAsia" w:ascii="微软雅黑" w:hAnsi="微软雅黑" w:eastAsia="微软雅黑" w:cs="微软雅黑"/>
+                          <w:b/>
+                          <w:bCs/>
+                          <w:color w:val="555555"/>
+                          <w:kern w:val="0"/>
+                          <w:sz w:val="21"/>
+                          <w:szCs w:val="21"/>
+                          <w:lang w:val="en-US" w:eastAsia="zh-CN" w:bidi="ar"/>
+                        </w:rPr>
+                        <w:t>编辑与导出：</w:t>
+                      </w:r>
+                      <w:r>
+                        <w:rPr>
+                          <w:rFonts w:hint="eastAsia" w:ascii="微软雅黑" w:hAnsi="微软雅黑" w:eastAsia="微软雅黑" w:cs="微软雅黑"/>
+                          <w:b w:val="0"/>
+                          <w:bCs w:val="0"/>
+                          <w:color w:val="555555"/>
+                          <w:kern w:val="0"/>
+                          <w:sz w:val="21"/>
+                          <w:szCs w:val="21"/>
+                          <w:lang w:val="en-US" w:eastAsia="zh-CN" w:bidi="ar"/>
+                        </w:rPr>
+                        <w:t>TipTap 富文本 + Zod/RHF 多模块表单；模板 Manifest 与内容解耦；预览与 PDF 共用运行时保证所见即所得</w:t>
+                      </w:r>
+                    </w:p>
+                    <w:p>
+                      <w:pPr>
+                        <w:numPr>
+                          <w:ilvl w:val="0"/>
+                          <w:numId w:val="0"/>
+                        </w:numPr>
+                        <w:adjustRightInd w:val="0"/>
+                        <w:snapToGrid w:val="0"/>
+                        <w:ind w:leftChars="0"/>
+                        <w:rPr>
+                          <w:rFonts w:hint="eastAsia" w:ascii="微软雅黑" w:hAnsi="微软雅黑" w:eastAsia="微软雅黑" w:cs="微软雅黑"/>
+                          <w:b w:val="0"/>
+                          <w:bCs w:val="0"/>
+                          <w:color w:val="555555"/>
+                          <w:kern w:val="0"/>
+                          <w:sz w:val="21"/>
+                          <w:szCs w:val="21"/>
+                          <w:lang w:val="en-US" w:eastAsia="zh-CN" w:bidi="ar"/>
+                        </w:rPr>
+                      </w:pPr>
+                      <w:r>
+                        <w:rPr>
+                          <w:rFonts w:hint="eastAsia" w:ascii="微软雅黑" w:hAnsi="微软雅黑" w:eastAsia="微软雅黑" w:cs="微软雅黑"/>
+                          <w:b/>
+                          <w:bCs/>
+                          <w:color w:val="555555"/>
+                          <w:kern w:val="0"/>
+                          <w:sz w:val="21"/>
+                          <w:szCs w:val="21"/>
+                          <w:lang w:val="en-US" w:eastAsia="zh-CN" w:bidi="ar"/>
+                        </w:rPr>
+                        <w:t>AI 应用：</w:t>
+                      </w:r>
+                      <w:r>
+                        <w:rPr>
+                          <w:rFonts w:hint="eastAsia" w:ascii="微软雅黑" w:hAnsi="微软雅黑" w:eastAsia="微软雅黑" w:cs="微软雅黑"/>
+                          <w:b w:val="0"/>
+                          <w:bCs w:val="0"/>
+                          <w:color w:val="555555"/>
+                          <w:kern w:val="0"/>
+                          <w:sz w:val="21"/>
+                          <w:szCs w:val="21"/>
+                          <w:lang w:val="en-US" w:eastAsia="zh-CN" w:bidi="ar"/>
+                        </w:rPr>
+                        <w:t>经 Edge Function 代理 DeepSeek，落地 ATS 结构化诊断（扫描与写入分离）、划词多候选改写、JD 两阶段派生与血缘管理</w:t>
+                      </w:r>
+                    </w:p>
+                    <w:p>
+                      <w:pPr>
+                        <w:numPr>
+                          <w:ilvl w:val="0"/>
+                          <w:numId w:val="0"/>
+                        </w:numPr>
+                        <w:adjustRightInd w:val="0"/>
+                        <w:snapToGrid w:val="0"/>
+                        <w:ind w:leftChars="0"/>
+                        <w:rPr>
+                          <w:rFonts w:hint="eastAsia" w:ascii="微软雅黑" w:hAnsi="微软雅黑" w:eastAsia="微软雅黑" w:cs="微软雅黑"/>
+                          <w:b w:val="0"/>
+                          <w:bCs w:val="0"/>
+                          <w:color w:val="555555"/>
+                          <w:kern w:val="0"/>
+                          <w:sz w:val="21"/>
+                          <w:szCs w:val="21"/>
+                          <w:lang w:val="en-US" w:eastAsia="zh-CN" w:bidi="ar"/>
+                        </w:rPr>
+                      </w:pPr>
+                      <w:r>
+                        <w:rPr>
+                          <w:rFonts w:hint="eastAsia" w:ascii="微软雅黑" w:hAnsi="微软雅黑" w:eastAsia="微软雅黑" w:cs="微软雅黑"/>
+                          <w:b/>
+                          <w:bCs/>
+                          <w:color w:val="555555"/>
+                          <w:kern w:val="0"/>
+                          <w:sz w:val="21"/>
+                          <w:szCs w:val="21"/>
+                          <w:lang w:val="en-US" w:eastAsia="zh-CN" w:bidi="ar"/>
+                        </w:rPr>
+                        <w:t>实时协作：</w:t>
+                      </w:r>
+                      <w:r>
+                        <w:rPr>
+                          <w:rFonts w:hint="eastAsia" w:ascii="微软雅黑" w:hAnsi="微软雅黑" w:eastAsia="微软雅黑" w:cs="微软雅黑"/>
+                          <w:b w:val="0"/>
+                          <w:bCs w:val="0"/>
+                          <w:color w:val="555555"/>
+                          <w:kern w:val="0"/>
+                          <w:sz w:val="21"/>
+                          <w:szCs w:val="21"/>
+                          <w:lang w:val="en-US" w:eastAsia="zh-CN" w:bidi="ar"/>
+                        </w:rPr>
+                        <w:t>基于 Automerge CRDT + Supabase Realtime，支持分享链接、远程光标与离线合并</w:t>
+                      </w:r>
+                    </w:p>
+                    <w:p>
+                      <w:pPr>
+                        <w:numPr>
+                          <w:ilvl w:val="0"/>
+                          <w:numId w:val="0"/>
+                        </w:numPr>
+                        <w:adjustRightInd w:val="0"/>
+                        <w:snapToGrid w:val="0"/>
+                        <w:ind w:leftChars="0"/>
+                        <w:rPr>
+                          <w:rFonts w:hint="eastAsia" w:ascii="微软雅黑" w:hAnsi="微软雅黑" w:eastAsia="微软雅黑" w:cs="微软雅黑"/>
+                          <w:b w:val="0"/>
+                          <w:bCs w:val="0"/>
+                          <w:i/>
+                          <w:iCs/>
+                          <w:color w:val="555555"/>
+                          <w:kern w:val="0"/>
+                          <w:sz w:val="21"/>
+                          <w:szCs w:val="21"/>
+                          <w:lang w:val="en-US" w:eastAsia="zh-CN" w:bidi="ar"/>
+                        </w:rPr>
+                      </w:pPr>
+                      <w:r>
+                        <w:rPr>
+                          <w:rFonts w:hint="eastAsia" w:ascii="微软雅黑" w:hAnsi="微软雅黑" w:eastAsia="微软雅黑" w:cs="微软雅黑"/>
+                          <w:b/>
+                          <w:bCs/>
+                          <w:color w:val="555555"/>
+                          <w:kern w:val="0"/>
+                          <w:sz w:val="21"/>
+                          <w:szCs w:val="21"/>
+                          <w:lang w:val="en-US" w:eastAsia="zh-CN" w:bidi="ar"/>
+                        </w:rPr>
+                        <w:t>Github</w:t>
+                      </w:r>
+                      <w:r>
+                        <w:rPr>
+                          <w:rFonts w:hint="eastAsia" w:ascii="微软雅黑" w:hAnsi="微软雅黑" w:eastAsia="微软雅黑" w:cs="微软雅黑"/>
+                          <w:b w:val="0"/>
+                          <w:bCs w:val="0"/>
+                          <w:color w:val="555555"/>
+                          <w:kern w:val="0"/>
+                          <w:sz w:val="21"/>
+                          <w:szCs w:val="21"/>
+                          <w:lang w:val="en-US" w:eastAsia="zh-CN" w:bidi="ar"/>
+                        </w:rPr>
+                        <w:t>:</w:t>
+                      </w:r>
+                      <w:r>
+                        <w:rPr>
+                          <w:rFonts w:hint="eastAsia" w:ascii="微软雅黑" w:hAnsi="微软雅黑" w:eastAsia="微软雅黑" w:cs="微软雅黑"/>
+                          <w:b w:val="0"/>
+                          <w:bCs w:val="0"/>
+                          <w:i/>
+                          <w:iCs/>
+                          <w:color w:val="555555"/>
+                          <w:kern w:val="0"/>
+                          <w:sz w:val="21"/>
+                          <w:szCs w:val="21"/>
+                          <w:lang w:val="en-US" w:eastAsia="zh-CN" w:bidi="ar"/>
+                        </w:rPr>
+                        <w:t xml:space="preserve"> https://github.com/506-FETL/resume</w:t>
+                      </w:r>
+                    </w:p>
+                  </w:txbxContent>
+                </v:textbox>
+              </v:shape>
+            </w:pict>
+          </mc:Fallback>
+        </mc:AlternateContent>
+      </w:r>
       <w:r>
         <mc:AlternateContent>
           <mc:Choice Requires="wpg">
@@ -6612,7 +6672,7 @@
                   <wp:posOffset>22860</wp:posOffset>
                 </wp:positionH>
                 <wp:positionV relativeFrom="page">
-                  <wp:posOffset>10615930</wp:posOffset>
+                  <wp:posOffset>10401300</wp:posOffset>
                 </wp:positionV>
                 <wp:extent cx="6962775" cy="81280"/>
                 <wp:effectExtent l="0" t="0" r="28575" b="0"/>
@@ -6717,7 +6777,7 @@
           </mc:Choice>
           <mc:Fallback>
             <w:pict>
-              <v:group id="_x0000_s1026" o:spid="_x0000_s1026" o:spt="203" style="position:absolute;left:0pt;margin-left:1.8pt;margin-top:835.9pt;height:6.4pt;width:548.25pt;mso-position-vertical-relative:page;z-index:251670528;mso-width-relative:page;mso-height-relative:page;" coordsize="6962775,81467" o:gfxdata="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">
+              <v:group id="_x0000_s1026" o:spid="_x0000_s1026" o:spt="203" style="position:absolute;left:0pt;margin-left:1.8pt;margin-top:819pt;height:6.4pt;width:548.25pt;mso-position-vertical-relative:page;z-index:251670528;mso-width-relative:page;mso-height-relative:page;" coordsize="6962775,81467" o:gfxdata="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">
                 <o:lock v:ext="edit" aspectratio="f"/>
                 <v:line id="_x0000_s1026" o:spid="_x0000_s1026" o:spt="20" style="position:absolute;left:0;top:0;height:0;width:6962775;" filled="f" stroked="t" coordsize="21600,21600" o:gfxdata="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">
                   <v:fill on="f" focussize="0,0"/>

</xml_diff>